<commit_message>
Proofcheck Flour Play Dutch: MINOR (17 fixes)
Co-Authored-By: Claude Opus 5.5 <noreply@anthropic.com>
Claude-Session: https://claude.ai/code/session_012Cm8JxdqzjuttdUSdkQCUg
</commit_message>
<xml_diff>
--- a/translated/corrected/Flour Play - ASSEMBLED - FORMATTED_Dutch.docx
+++ b/translated/corrected/Flour Play - ASSEMBLED - FORMATTED_Dutch.docx
@@ -132,7 +132,7 @@
     <w:p/>
     <w:p>
       <w:r>
-        <w:t xml:space="preserve">Het stadje grijpt naar de makkelijke verdachten: de slager die het laadhek op slot deed, het gezin dat achterloopt met de stookolie, een verveelde jongen met een gestolen spuitbus. Jessica zoekt naar hetgeen dat klopt — want wie dit ook heeft gedaan, die kocht het poeder, kende de dosis en diende een klacht in waarin de gezondheidsvoorschriften tot op het subartikel werden aangehaald. Dat is geen opwelling. Dat is vakmanschap.</w:t>
+        <w:t xml:space="preserve">Het stadje grijpt naar de makkelijke verdachten: de slager die het laadhek op slot deed, het gezin dat achterloopt met de stookolie, een verveelde jongen met een gestolen spuitbus. Jessica zoekt naar datgene wat klopt — want wie dit ook heeft gedaan, die kocht het poeder, kende de dosis en diende een klacht in waarin de gezondheidsvoorschriften tot op het subartikel werden aangehaald. Dat is geen opwelling. Dat is vakmanschap.</w:t>
       </w:r>
     </w:p>
     <w:p/>
@@ -2623,7 +2623,7 @@
     <w:p/>
     <w:p>
       <w:r>
-        <w:t xml:space="preserve">De meesten betuigden hun steun. Kelly kwam voor het donker langs met een gezicht dat stond als het weer, las de kennisgeving, prevelde een woord dat ik niet zal herhalen, en ging direct bij Greta zitten om haar gezelschap te houden. Hal nam de doos met broodjes mee voor de ton. ‘Er is geen schonere keuken in de hele county,’ zei hij zacht tegen wie er maar dichtbij stond. Haar vrienden sloten de rijen zonder dat daarom was gevraagd.</w:t>
+        <w:t xml:space="preserve">De meesten betuigden hun steun. Kelly kwam voor het donker langs met een gezicht als een onweersbui, las de kennisgeving, prevelde een woord dat ik niet zal herhalen, en ging direct bij Greta zitten om haar gezelschap te houden. Hal nam de doos met broodjes mee voor de ton. ‘Er is geen schonere keuken in de hele county,’ zei hij zacht tegen wie er maar dichtbij stond. Haar vrienden sloten de rijen zonder dat daarom was gevraagd.</w:t>
       </w:r>
     </w:p>
     <w:p/>
@@ -2924,7 +2924,7 @@
     </w:p>
     <w:p>
       <w:r>
-        <w:t xml:space="preserve">‘Ik zei niet dat er niets mis mee was. Ik zei dat er niets mis was met de bloem.’ Hij draaide de pot in het licht. ‘Er zit iets in. Iets dat geen bloem is. Het is er doorheen gemengd, fijn en gelijkmatig, en dat is wat haar baksels laat verzuren, omdat het in een bak droog helemaal niets doet en zodra het nat wordt alles. Als je hierdoor een deeg mengt, verzuurt dat het hele beslag, en de oven stuwt die geschifte rand omhoog door de kruim en op de tong. Daarom heeft ze het door vier schone bakbeurten en een nieuwe zak gist gejaagd en het nooit ontdekt. Ze was op zoek naar een slecht ingrediënt. Dit is geen slecht ingrediënt. Het is een toevoeging.’</w:t>
+        <w:t xml:space="preserve">‘Ik zei niet dat er niets mis mee was. Ik zei dat er niets mis was met de bloem.’ Hij draaide de pot in het licht. ‘Er zit iets in. Iets dat geen bloem is. Het is er doorheen gemengd, fijn en gelijkmatig, en dat is wat haar baksels laat verzuren, omdat het in een bak droog helemaal niets doet en zodra het nat wordt alles. Als je een deeg maakt waar dit doorheen zit, verzuurt dat het hele beslag, en de oven stuwt die geschifte rand omhoog door de kruim en op de tong. Daarom heeft ze het door vier schone bakbeurten en een nieuwe zak gist gejaagd en het nooit ontdekt. Ze was op zoek naar een slecht ingrediënt. Dit is geen slecht ingrediënt. Het is een toevoeging.’</w:t>
       </w:r>
     </w:p>
     <w:p>
@@ -2979,7 +2979,7 @@
     </w:p>
     <w:p>
       <w:r>
-        <w:t>En toen legde het ding dat los rondloopt in het stadje zijn hand op mijn mouw.</w:t>
+        <w:t xml:space="preserve">En toen legde het ding dat los rondliep in het stadje zijn hand op mijn mouw.</w:t>
       </w:r>
     </w:p>
     <w:p>
@@ -3025,7 +3025,7 @@
     <w:p/>
     <w:p>
       <w:r>
-        <w:t>De vraag was overnacht van vorm veranderd, zoals een steen die je te lang bij je draagt in je zak rondgesleten raakt, en tegen de ochtend was hij gereduceerd tot één hard woord. Toegang. Doc had beantwoord wat het was, in zijn bruine flesjes, en had me opgezadeld met de hele vraag naar het wie. En het wie begon, zoals elke dergelijke vraag moest beginnen, met een simpelere. Niet wie haar haat. Wie kon bij haar bloem komen.</w:t>
+        <w:t xml:space="preserve">De vraag was overnacht van vorm veranderd, zoals een steen die je te lang bij je draagt in je zak rondgesleten raakt, en tegen de ochtend was hij gereduceerd tot één hard woord. Toegang. Doc had beantwoord wat het was, in zijn bruine flesjes, en had me opgezadeld met de hele vraag naar het wie. En het wie begon, zoals elke dergelijke vraag moest beginnen, met een simpelere. Niet wie haar haatte. Wie kon bij haar bloem komen.</w:t>
       </w:r>
     </w:p>
     <w:p/>
@@ -3121,7 +3121,7 @@
     <w:p/>
     <w:p>
       <w:r>
-        <w:t>Omdat ik, zodra ik me had afgevraagd wie de bloem kon bereiken, het antwoord moest volgen langs dat vertrapte perron. Drie deuren van Greta’s open deur was de enige man die drie en vier ochtenden per week voor dag en dauw op dat erf te vinden was.</w:t>
+        <w:t xml:space="preserve">Omdat ik, zodra ik me had afgevraagd wie de bloem kon bereiken, het antwoord moest volgen langs dat vertrapte perron. Drie deuren van Greta’s open deur vandaan was de enige man die drie à vier ochtenden per week voor dag en dauw op dat erf te vinden was.</w:t>
       </w:r>
     </w:p>
     <w:p/>
@@ -3145,7 +3145,7 @@
     <w:p/>
     <w:p>
       <w:r>
-        <w:t>Wat betreft de toegang oogde hij slechter dan ooit, omdat toegang het enige was waaraan het in de hele zaak had ontbroken, en zie hier, hij had er zijn naam op staan.</w:t>
+        <w:t xml:space="preserve">Wat betreft de toegang oogde hij slechter dan ooit, omdat toegang het enige was waaraan het in de hele zaak had ontbroken, en hier was ze dan, met zijn naam erop.</w:t>
       </w:r>
     </w:p>
     <w:p/>
@@ -3273,7 +3273,7 @@
     <w:p/>
     <w:p>
       <w:r>
-        <w:t xml:space="preserve">Ik haalde de ketel van het vuur. Ik had die koude lijn naar zijn poort getrokken op basis van toegang alleen, en toegang, had ik mezelf in de steeg gezegd, was een deuropening en geen vonnis. Hij stond pal in de deuropening, ja. Maar de kamer daarachter herbergde een humeur dat hij niet had en een stiel die hij niet kende.</w:t>
+        <w:t xml:space="preserve">Ik haalde de ketel van het vuur. Ik had die koude lijn naar zijn poort getrokken op basis van toegang alleen, en toegang, had ik mezelf in de steeg gezegd, was een deuropening en geen vonnis. Hij stond pal in de deuropening, ja. Maar de kamer daarachter herbergde een aard die hij niet had en een stiel die hij niet kende.</w:t>
       </w:r>
     </w:p>
     <w:p/>
@@ -3303,7 +3303,7 @@
     <w:p/>
     <w:p>
       <w:r>
-        <w:t xml:space="preserve">‘Ik houd je niet van je werk,’ zei ik. ‘Ik kwam je vertellen dat ik jou op het oog had. Voor Greta’s problemen. Op grond van het nuchtere feit dat jij vóór dag en dauw op dat erf bent en niemand anders de status heeft om dat te zijn.’ Ik had gemerkt dat het het beste was om een man de lelijke waarheid in zijn geheel aan te reiken en hem ernaar te laten kijken. ‘En ik kwam je vertellen dat ik je weer van dat lijstje heb geschrapt. Wat dit ook heeft aangericht, het vergde een humeur voor het duister en een bakkersvak voor dat poeder, en jij hebt geen van beide. Je maakt ruzie rond het middaguur, en je snijdt vlees. Dat past niet bij je.’</w:t>
+        <w:t xml:space="preserve">‘Ik houd je niet van je werk,’ zei ik. ‘Ik kwam je vertellen dat ik jou op het oog had. Voor Greta’s problemen. Op grond van het nuchtere feit dat jij vóór dag en dauw op dat erf bent en niemand anders de status heeft om dat te zijn.’ Ik had gemerkt dat het het beste was om een man de lelijke waarheid in zijn geheel aan te reiken en hem ernaar te laten kijken. ‘En ik kwam je vertellen dat ik je weer van dat lijstje heb geschrapt. Wat dit ook heeft aangericht, het vergde een aard die het duister opzoekt en een bakkersvak voor dat poeder, en jij hebt geen van beide. Je maakt ruzie rond het middaguur, en je snijdt vlees. Dat past niet bij je.’</w:t>
       </w:r>
     </w:p>
     <w:p/>
@@ -3339,7 +3339,7 @@
     <w:p/>
     <w:p>
       <w:r>
-        <w:t>Ik sloeg het op, elk woord. Een volwassen postuur met een doel, in een losse, bleke werkjas, voor dag en dauw, bij de enige deur die een wetende hand kon bereiken. Geen jongen, en geen humeur.</w:t>
+        <w:t xml:space="preserve">Ik sloeg het op, elk woord. Een volwassen postuur met een doel, in een losse, bleke werkjas, voor dag en dauw, bij de enige deur die een wetende hand kon bereiken. Geen jongen, en geen driftkop.</w:t>
       </w:r>
     </w:p>
     <w:p/>
@@ -4383,7 +4383,7 @@
     <w:p/>
     <w:p>
       <w:r>
-        <w:t xml:space="preserve">‘Heb je hier wat aan?’ vroeg hij.</w:t>
+        <w:t xml:space="preserve">‘Hebt u hier wat aan?’ vroeg hij.</w:t>
       </w:r>
     </w:p>
     <w:p/>
@@ -4401,7 +4401,7 @@
     <w:p/>
     <w:p>
       <w:r>
-        <w:t>Hij riste zijn jas dicht tot aan zijn kin en pakte zijn papieren zakje op. Pip keek het met lange tanden na.</w:t>
+        <w:t xml:space="preserve">Hij riste zijn jas dicht tot aan zijn kin en pakte zijn papieren zakje op. Pip keek het met tegenzin na.</w:t>
       </w:r>
     </w:p>
     <w:p/>
@@ -5028,7 +5028,7 @@
     </w:p>
     <w:p>
       <w:r>
-        <w:t xml:space="preserve">‘Petes busje,’ zei ik. ‘Dat vertelde hij me tweemaal. Eén keer bij zijn blok, boven jouw gebraad. Een busje bij de apotheek voor het licht werd. Lichten uit. Niet van de vleesleverancier. Een kenteken van buiten de stad dat hij niet had kunnen lezen. En toen nog eens, de ochtend dat ik hem ging vrijpleiten. Zelfde plek. Draaiende motor.’</w:t>
+        <w:t xml:space="preserve">‘Petes busje,’ zei ik. ‘Dat vertelde hij me tweemaal. Eén keer bij zijn blok, bij jouw gebraad. Een busje bij de apotheek voor het licht werd. Lichten uit. Niet van de vleesleverancier. Een kenteken van buiten de stad dat hij niet had kunnen lezen. En toen nog eens, de ochtend dat ik hem ging vrijpleiten. Zelfde plek. Draaiende motor.’</w:t>
       </w:r>
     </w:p>
     <w:p>
@@ -5411,7 +5411,7 @@
     <w:p/>
     <w:p>
       <w:r>
-        <w:t xml:space="preserve">‘Twee.’ Ze hoefde daar niet over na te denken. ‘Eén zit aan mijn sleutelbos. Die andere zat aan die van Joyce. Ze legde haar winkelsleutel op deze toonbank op de dag dat ze vertrok, en ik heb nooit meer aan de poortsleutel gedacht. Het is nog steeds hetzelfde slot dat op die poort zit sinds Harold hem heeft opgehangen. Ik heb hem nooit vervangen.’ Ze keek me aan. ‘Waarom zou ik ook? Ze had haar geld gepakt en was naar Bridgton gegaan. Wat moest zij in vredesnaam met mijn poort?’</w:t>
+        <w:t xml:space="preserve">‘Twee.’ Ze hoefde daar niet over na te denken. ‘Eén zit aan mijn sleutelbos. Die andere zat aan die van Joyce. Ze legde haar winkelsleutel op deze toonbank op de dag dat ze vertrok, en ik heb nooit meer aan de poortsleutel gedacht. Het is nog steeds hetzelfde slot dat op die poort zit sinds Harold het heeft opgehangen. Ik heb het nooit vervangen.’ Ze keek me aan. ‘Waarom zou ik ook? Ze had haar geld gepakt en was naar Bridgton gegaan. Wat moest zij in vredesnaam met mijn poort?’</w:t>
       </w:r>
     </w:p>
     <w:p/>
@@ -5507,7 +5507,7 @@
     <w:p/>
     <w:p>
       <w:r>
-        <w:t xml:space="preserve">‘Dat weet ik nog niet,’ zei ik. ‘Ik kom erachter. Ik kom er pas mee naar je toe als dat zo is.’</w:t>
+        <w:t xml:space="preserve">‘Dat weet ik nog niet,’ zei ik. ‘Ik kom erachter. Ik kom er pas mee naar je toe als ik het zeker weet.’</w:t>
       </w:r>
     </w:p>
     <w:p/>
@@ -5939,7 +5939,7 @@
     </w:p>
     <w:p>
       <w:r>
-        <w:t xml:space="preserve">‘In de klacht werd de koelcel de koude kamer genoemd en de handwasbak de Hobart-spoelbak. Greta zegt dat niemand dat sinds Joyce nog zo heeft genoemd. Het slot van de poort op het erf is nooit vervangen, en Pete zegt dat het er steeds af springt. En het zuur worden stopte op de ochtend dat Greta haar achterdeur op de grendel deed nadat de baksteen was gegooid, dus degene die het deed, kwam op die manier binnen. Hij zag voor dag en dauw een busje bij de apotheek staan, lichten uit, niet van de vleesleverancier. Gisteren keek hij naar Claire’s printje van het busje van Wendt’s en zei hij: “Dat is ’m.”’</w:t>
+        <w:t xml:space="preserve">‘In de klacht werd de koelcel de koude kamer genoemd en de handwasbak de Hobart-spoelbak. Greta zegt dat niemand dat sinds Joyce nog zo heeft genoemd. Het slot van de poort op het erf is nooit vervangen, en Pete zegt dat het er steeds af springt. En het zuur worden stopte op de ochtend dat Greta haar achterdeur op de grendel deed nadat de baksteen was gegooid, dus degene die het deed, kwam op die manier binnen. Pete zag voor dag en dauw een busje bij de apotheek staan, lichten uit, niet van de vleesleverancier. Gisteren keek hij naar Claire’s printje van het busje van Wendt’s en zei hij: “Dat is ’m.”’</w:t>
       </w:r>
     </w:p>
     <w:p>
@@ -6298,7 +6298,7 @@
     </w:p>
     <w:p>
       <w:r>
-        <w:t xml:space="preserve">‘Vijfentwintig jaar,’ zei ze tegen Greta. ‘Je hebt hem nooit vervangen. Hemel, Gret.’</w:t>
+        <w:t xml:space="preserve">‘Vijfentwintig jaar,’ zei ze tegen Greta. ‘Je hebt het slot nooit vervangen. Hemel, Gret.’</w:t>
       </w:r>
     </w:p>
     <w:p>

</xml_diff>

<commit_message>
Full proofcheck Flour Play Dutch: SIGNIFICANT (115 fixes)
Co-Authored-By: Claude Opus 5.5 <noreply@anthropic.com>
Claude-Session: https://claude.ai/code/session_012Cm8JxdqzjuttdUSdkQCUg
</commit_message>
<xml_diff>
--- a/translated/corrected/Flour Play - ASSEMBLED - FORMATTED_Dutch.docx
+++ b/translated/corrected/Flour Play - ASSEMBLED - FORMATTED_Dutch.docx
@@ -419,7 +419,7 @@
     <w:p/>
     <w:p>
       <w:r>
-        <w:t xml:space="preserve">Omdat ik het verschil kende. Ik leefde inmiddels al lang genoeg te midden van de kerstmagie. Lang genoeg om het in mijn botten te herkennen, net zo eenvoudig als een voetstap op mijn trap. Dit was geen kind met koude vingers. De magie was losgebroken in Frost Falls. Ze was los sinds we arriveerden, op zoek naar een thuis. Mijn man was er eentje aan het bouwen. Langzaam en geduldig in zijn werkplaats, een haard waar ze zich kon nestelen, en ze kroop elke dag een stukje dichter bij het vuur. Maar ze had zich nog niet genesteld. Ze dwaalde ’s nachts nog door het stadje, onhandig en volstrekt zonder kwaadaardigheid, en deed de kleine onmogelijke dingen die magie doet als ze meer gevoel heeft dan verstand. De festivalverlichting van oranje in goud veranderen. En nu, naar het zich aanziet, de sneeuwman van een kind in het donker omdraaien zodat hij kon kijken naar wat zijn dwalende aandacht ook maar had getrokken.</w:t>
+        <w:t xml:space="preserve">Omdat ik het verschil kende. Ik leefde inmiddels al lang genoeg te midden van de kerstmagie. Lang genoeg om het in mijn botten te herkennen, zo onmiskenbaar als een voetstap op mijn trap. Dit was geen kind met koude vingers. De magie was losgebroken in Frost Falls. Ze was los sinds we arriveerden, op zoek naar een thuis. Mijn man was er eentje aan het bouwen. Langzaam en geduldig in zijn werkplaats, een haard waar ze zich kon nestelen, en ze kroop elke dag een stukje dichter bij het vuur. Maar ze had zich nog niet genesteld. Ze dwaalde ’s nachts nog door het stadje, onhandig en volstrekt zonder kwaadaardigheid, en deed de kleine onmogelijke dingen die magie doet als ze meer gevoel heeft dan verstand. De festivalverlichting van oranje in goud veranderen. En nu, naar het zich aanziet, de sneeuwman van een kind in het donker omdraaien zodat hij kon kijken naar wat zijn dwalende aandacht ook maar had getrokken.</w:t>
       </w:r>
     </w:p>
     <w:p/>
@@ -598,7 +598,7 @@
     <w:p/>
     <w:p>
       <w:r>
-        <w:t>Pip was me gevolgd. Dat deed ze altijd als ik ergens doelbewust op afging, voor het geval dat doel iets met vis te maken had. Ze waggelde om mijn enkels heen naar de gemorste bloem op de tegels en stak nieuwsgierig haar snavel ernaar uit. Ze onderzocht alles op neushoogte.</w:t>
+        <w:t xml:space="preserve">Pip was me gevolgd. Dat deed ze altijd als ik ergens doelbewust op afging, voor het geval dat doel iets met vis te maken had. Ze waggelde om mijn enkels heen naar de gemorste bloem op de tegels en stak nieuwsgierig haar snavel ernaar uit. Ze onderzocht alles met de neus voorop.</w:t>
       </w:r>
     </w:p>
     <w:p/>
@@ -640,7 +640,7 @@
     <w:p/>
     <w:p>
       <w:r>
-        <w:t xml:space="preserve">Ze liet me begaan. Bij de deur klopte ze me zelfs even bemoedigend op de hand, om mij even te troosten, uit oude gewoonte.</w:t>
+        <w:t xml:space="preserve">Ze liet me begaan. Bij de deur klopte ze me zelfs even op de hand, om mij uit oude gewoonte een moment te troosten.</w:t>
       </w:r>
     </w:p>
     <w:p/>
@@ -774,7 +774,7 @@
     </w:p>
     <w:p>
       <w:r>
-        <w:t xml:space="preserve">‘Twee verdiepingsovens,’ zei ze, ‘op gas, met stoominjectie. Je krijgt geen fatsoenlijke korst zonder, wat de bakkers op het platteland ook mogen beweren. Een deeguitroller daar, voor de getoerde degen. Een shockfroster, en ik durf mijn schort erom te verwedden dat geen enkele keuken in deze county die heeft.’ Ze streek met een hand over het staal. ‘Ik ben opgeleid in Lyon. Daarna elf jaar in Montreal, waarvan twee jaar aan het hoofd van een patisserie die met Kerstmis de helft van de stad van gebak voorzag. Ik weet wat december is, Jessica. Frost Falls,’ ze glimlachte rondom zich in haar glimmende ruimte, ‘Frost Falls wordt een rustige periode.’</w:t>
+        <w:t xml:space="preserve">‘Twee verdiepingsovens,’ zei ze, ‘op gas, met stoominjectie. Je krijgt geen fatsoenlijke korst zonder, wat de bakkers op het platteland ook mogen beweren. Een deeguitroller daar, voor de getoerde degen. Een shockfroster, en ik durf mijn schort erom te verwedden dat geen enkele keuken in deze county die heeft.’ Ze streek met een hand over het staal. ‘Ik ben opgeleid in Lyon. Daarna elf jaar in Montreal, waarvan twee jaar aan het hoofd van een patisserie die met Kerstmis de helft van de stad van gebak voorzag. Ik weet wat december is, Jessica. Frost Falls,’ ze glimlachte rondom zich in haar glimmende ruimte, ‘Frost Falls wordt een rustpauze.’</w:t>
       </w:r>
     </w:p>
     <w:p>
@@ -799,7 +799,7 @@
     </w:p>
     <w:p>
       <w:r>
-        <w:t>Ze was goed gezelschap, dat kon ik niet ontkennen. Ze liet me alles zien, en haar liefde voor het ambacht was oprecht. Ze vroeg hoe het met Nick en mij ging, en ze onthield de antwoorden. Bij de deur drukte ze me een klein gouden doosje financiers in de hand, warm uit de oven, van die kleine, compacte cakejes van gebruinde boter en amandel. Ik at er eentje op het trottoir op. Het was buitengewoon lekker, en ik ben er de rest van de dag aan blijven denken.</w:t>
+        <w:t xml:space="preserve">Ze was goed gezelschap, dat kon ik niet ontkennen. Ze liet me alles zien, en haar liefde voor het ambacht was oprecht. Ze vroeg hoe Nick en ik ons hier thuis begonnen te voelen, en ze onthield de antwoorden. Bij de deur drukte ze me een klein gouden doosje financiers in de hand, warm uit de oven, van die kleine, compacte cakejes van gebruinde boter en amandel. Ik at er eentje op het trottoir op. Het was buitengewoon lekker, en ik ben er de rest van de dag aan blijven denken.</w:t>
       </w:r>
     </w:p>
     <w:p>
@@ -1278,7 +1278,7 @@
     <w:p/>
     <w:p>
       <w:r>
-        <w:t>Greta was de keuken ingelopen om thee te zetten voor iedereen, en daar viel niet bij te helpen. Joyce nam plaats op de kruk aan het uiteinde van de toonbank, naast het Thanksgiving-bestelboek, dat nog net zo openlag als maandag. Ze zette een leesbril op en haalde haar telefoon tevoorschijn.</w:t>
+        <w:t xml:space="preserve">Greta was de keuken ingelopen om thee te zetten voor iedereen, en ze liet zich daar niet bij helpen. Joyce nam plaats op de kruk aan het uiteinde van de toonbank, naast het Thanksgiving-bestelboek, dat nog net zo openlag als maandag. Ze zette een leesbril op en haalde haar telefoon tevoorschijn.</w:t>
       </w:r>
     </w:p>
     <w:p/>
@@ -1493,7 +1493,7 @@
     <w:p/>
     <w:p>
       <w:r>
-        <w:t xml:space="preserve">‘Nou niks niet. Jullie hebben het allemaal gedacht, anders zat je nu niet naar je schoot te staren.’ Dot wond snel en doelgericht een twijg vast. ‘Pete en Greta liggen al sinds de zomer met elkaar in de clinch over die achterste steeg.’</w:t>
+        <w:t xml:space="preserve">‘Nou niks niet. Jullie hebben het allemaal gedacht, anders zaten jullie nu niet naar je schoot te staren.’ Dot wond snel en doelgericht een twijg vast. ‘Pete en Greta liggen al sinds de zomer met elkaar in de clinch over die achterste steeg.’</w:t>
       </w:r>
     </w:p>
     <w:p/>
@@ -1523,7 +1523,7 @@
     <w:p/>
     <w:p>
       <w:r>
-        <w:t xml:space="preserve">Ik legde een takje neer, bond het vast en dacht aan Pete. Hij mopperde hardop en deed in stilte aardige dingen. Dat had ik wel over hem geleerd rondom Snowball, toen bleek dat hij elke ochtend de beste botten op zijn laadperron voor Walters hond achterliet. Een kleingeestige vete over een laadperron achtte ik hem best in staat.</w:t>
+        <w:t xml:space="preserve">Ik legde een takje neer, bond het vast en dacht aan Pete. Hij mopperde hardop en deed in stilte aardige dingen. Dat had ik wel over hem geleerd rondom Snowball, toen bleek dat hij elke ochtend de beste botten op zijn laadperron voor Walters hond achterliet. Tot een kleingeestige vete over een laadperron achtte ik hem best in staat.</w:t>
       </w:r>
     </w:p>
     <w:p/>
@@ -1595,7 +1595,7 @@
     <w:p/>
     <w:p>
       <w:r>
-        <w:t xml:space="preserve">Ik draaide mijn krans om. Uitlopende verf duidde voor mij eerder op haast dan op jeugd. Wie het had gedaan, wilde de muur gemarkeerd hebben en zelf vertrokken zijn voor dag en dauw. Een jongen die stoer wilde doen was blijven hangen om het te bewonderen. Toch hoefden de verf en de verpestte partijen niet van dezelfde hand te zijn: het kon één persoon zijn die tweemaal toesloeg, of een verveelde puber die iedereen over de Holly Jolly had horen praten en er graag bij wilde horen. Ik kon er m’n vinger niet achter leggen, en ik ging ook niet doen alsof dat wel zo was.</w:t>
+        <w:t xml:space="preserve">Ik draaide mijn krans om. Uitlopende verf duidde voor mij eerder op haast dan op jeugd. Wie het had gedaan, wilde de muur gemarkeerd hebben en zelf vertrokken zijn voor dag en dauw. Een jongen die stoer wilde doen was blijven hangen om het te bewonderen. Toch hoefden de verf en de verpestte partijen niet van dezelfde hand te zijn: het kon één persoon zijn die tweemaal toesloeg, of een verveelde puber die iedereen over de Holly Jolly had horen praten en er graag bij wilde horen. Ik kon niet zeggen welke van de twee het was, en ik ging ook niet doen alsof dat wel zo was.</w:t>
       </w:r>
     </w:p>
     <w:p/>
@@ -1762,13 +1762,13 @@
     <w:p/>
     <w:p>
       <w:r>
-        <w:t>Hij nam even de tijd om te antwoorden, en dat antwoord kwam via een omweg. Hij zette zijn argumenten zorgvuldig op een rij. Hij zat al sinds de ellende rond zijn persoon begon dag in dag uit in het archief. De papieren van het Genootschap waren door het gedoe van vorige maand een rommeltje geworden.</w:t>
-      </w:r>
-    </w:p>
-    <w:p/>
-    <w:p>
-      <w:r>
-        <w:t xml:space="preserve">‘Politiechef Tanaka heeft me opgedragen om de boel weer op orde te brengen,’ zei hij. ‘Onder haar toeziend oog en dat van het bestuur. Ik doe het minste werk en vraag toestemming voor de rest.’ Hij was niet in ere hersteld, en niets van wat hij die hele ochtend zei liet doorschemeren dat hij dat wel verwachtte. Als hij een doos van de bovenste plank wilde pakken, vroeg hij mij te getuigen dat hij die eerst in het register had opgeschreven. Hij schreef zijn naam met de welbewuste zorgvuldigheid van een man die wist dat zijn naam in een register niet langer het simpele feit was dat het ooit geweest was.</w:t>
+        <w:t xml:space="preserve">Hij nam even de tijd om te antwoorden, en dat antwoord kwam via een omweg. Hij zette zijn argumenten zorgvuldig op een rij. Hij zat al sinds de ellende rond zijn persoon aan het licht was gekomen dag in dag uit in het archief. De papieren van het Genootschap waren door het gedoe van vorige maand een rommeltje geworden.</w:t>
+      </w:r>
+    </w:p>
+    <w:p/>
+    <w:p>
+      <w:r>
+        <w:t xml:space="preserve">‘Politiechef Tanaka heeft me opgedragen om de boel weer op orde te brengen,’ zei hij. ‘Onder haar toeziend oog en dat van het bestuur. Ik doe het nederigste werk en vraag toestemming voor de rest.’ Hij was niet in ere hersteld, en niets van wat hij die hele ochtend zei liet doorschemeren dat hij dat wel verwachtte. Als hij een doos van de bovenste plank wilde pakken, vroeg hij mij te getuigen dat hij die eerst in het register had opgeschreven. Hij schreef zijn naam in de kolom met de welbewuste zorgvuldigheid van een man die wist dat zijn naam in een register niet langer het simpele feit was dat het ooit geweest was.</w:t>
       </w:r>
     </w:p>
     <w:p/>
@@ -1786,7 +1786,7 @@
     <w:p/>
     <w:p>
       <w:r>
-        <w:t xml:space="preserve">De eerste winter hebben we nauwelijks overleefd. Sneeuw tot aan de dakgoten in december en de molen nog niet gebouwd. Het was het delen dat ons redde. Geen enkele houtvoorraad was dat jaar van één man, geen enkele voorraadkast van één vrouw. We legden alles bij elkaar en kwamen de lente door met elke ziel van ons levend. Laten we vastleggen dat Frost Falls niet is gebouwd door de sterken. Het is gebouwd door de goede buren. — E. Frost, haer hand, 1809.</w:t>
+        <w:t xml:space="preserve">De eerste winter hebben we nauwelijks overleefd. Sneeuw tot aan de dakgoten in december en de molen nog niet gebouwd. Het was het delen dat ons redde. Geen enkele houtvoorraad was dat jaar van één man, geen enkele voorraadkast van één vrouw. We legden alles bij elkaar en haalden de lente met elke ziel van ons nog in leven. Laten we vastleggen dat Frost Falls niet is gebouwd door de sterken. Het is gebouwd door de goede buren. — E. Frost, haer hand, 1809.</w:t>
       </w:r>
     </w:p>
     <w:p/>
@@ -2096,7 +2096,7 @@
     </w:p>
     <w:p>
       <w:r>
-        <w:t xml:space="preserve">‘Ik zal je eens wat vertellen,’ zei hij zachter nu, de rancune uit zijn stem verdwenen, ‘en je moet er maar mee doen wat je wilt, want ik snap er zelf ook geen bal van. Die ochtenden dat ik in het donker op dat erf sta, ben ik niet de enige.’ Hij draaide zijn hoofd naar zijn voorraam en de winkels van Evergreen aan de overkant van de brink, met het erf daaraan onttrokken. ‘Er heeft iemand achter haar winkel rondgehangen. Vroeg, voordat er genoeg licht is om een gezicht te zien, alleen een gestalte, en meteen weg zodra mijn koplampen de hoek omkomen. Twee keer heb ik het gezien. Misschien drie keer. Iemand op een plek waar op dat uur niemand wat te zoeken heeft, strak tegen haar achterdeur aan, en dan weggaan.’ Hij fronste naar zijn handen. ‘De eerste keer dacht ik aan een zwerver, iemand die afkwam op de warmte van haar ventilatieroosters. Maar een zwerver blijft hangen, en deze deed dat niet. Deze was iets aan het doen. En ging ervandoor toen hij werd opgemerkt. Op een van die ochtenden stond er een busje dat ik niet kende, helemaal achteraan bij de apotheek geparkeerd met de lichten uit. Niet van de vleesleverancier. Met een kenteken van buiten de stad; ik heb het niet kunnen lezen.’</w:t>
+        <w:t xml:space="preserve">‘Ik zal je eens wat vertellen,’ zei hij zachter nu, de rancune uit zijn stem verdwenen, ‘en je moet er maar mee doen wat je wilt, want ik snap er zelf ook geen bal van. Die ochtenden dat ik in het donker op dat erf sta, ben ik niet de enige.’ Hij draaide zijn hoofd naar zijn voorraam en de winkels van Evergreen aan de overkant van de brink, met het erf daaraan onttrokken. ‘Er heeft iemand achter haar winkel rondgehangen. Vroeg, voordat er genoeg licht is om een gezicht te zien, alleen een gestalte, en meteen weg zodra mijn koplampen de hoek omkomen. Twee keer heb ik het gezien. Misschien drie keer. Iemand op een plek waar op dat uur niemand wat te zoeken heeft, strak tegen haar achterdeur aan, en dan weggaan.’ Hij fronste naar zijn handen. ‘De eerste keer dacht ik aan een zwerver, iemand die afkwam op de warmte van haar ventilatieroosters. Maar een zwerver blijft hangen, en deze deed dat niet. Deze was iets aan het doen. En ging ervandoor zodra die werd opgemerkt. Op een van die ochtenden stond er een busje dat ik niet kende, helemaal achteraan bij de apotheek geparkeerd met de lichten uit. Niet van de vleesleverancier. Met een kenteken van buiten de stad; ik heb het niet kunnen lezen.’</w:t>
       </w:r>
     </w:p>
     <w:p>
@@ -2181,7 +2181,7 @@
         <w:t>Ik denk niet dat hij het heeft gedaan.</w:t>
       </w:r>
       <w:r>
-        <w:t xml:space="preserve"> Ik wendde de zin in mijn gedachten en mocht de klank ervan niet. </w:t>
+        <w:t xml:space="preserve"> Ik draaide de zin in gedachten om en om en mocht de klank ervan niet. </w:t>
       </w:r>
       <w:r>
         <w:rPr>
@@ -2199,7 +2199,7 @@
         <w:t>hij heeft het niet gedaan</w:t>
       </w:r>
       <w:r>
-        <w:t>. In een lang leven had ik wel vaker gezien dat iemand op minder overtuigende gronden werd vrijgepleit die het uiteindelijk toch had gedaan. Het verschil tussen die twee zinnen was al mijn hoofdbrekens. Dus schreef ik geen van beide in het logboek. Ik droeg het gebraad naar binnen en liet de man staan waar hij stond: niet vrijgesproken, niet aangeklaagd.</w:t>
+        <w:t xml:space="preserve">. In een lang leven had ik wel vaker gezien dat iemand op minder overtuigende gronden werd vrijgepleit die het uiteindelijk toch had gedaan. Het verschil tussen die twee zinnen was precies mijn probleem. Dus schreef ik geen van beide in het logboek. Ik droeg het gebraad naar binnen en liet de man staan waar hij stond: niet vrijgesproken, niet aangeklaagd.</w:t>
       </w:r>
     </w:p>
     <w:p>
@@ -2255,7 +2255,7 @@
     </w:p>
     <w:p>
       <w:r>
-        <w:t>Dat het sinds Halloween geen graad had gedooid, mocht onbeproefd voorbijgaan.</w:t>
+        <w:t xml:space="preserve">Dat het sinds Halloween geen graad had gedooid, bleef maar onbesproken.</w:t>
       </w:r>
     </w:p>
     <w:p>
@@ -2532,7 +2532,7 @@
         <w:t xml:space="preserve">Er hangt een luchtje. Ik heb een muis gezien. Mijn broodje was van binnen rauw.</w:t>
       </w:r>
       <w:r>
-        <w:t xml:space="preserve"> Gevoel, meestal, half uit rancune voortkomend, en die rancune filter ik al op de stoep voordat ik mijn map opengooi.’ Hij zette zijn hoed recht. ‘Deze las niet zo. Die was getyped en noemde de subsecties bij naam. Er werd precies naar de norm voor de handwasbaktemperatuur verwezen, hoofdstuk en lid. Het voegwerk en de deurnaad werden met vaktermen aangeduid nog voordat ik ook maar een stap binnen had gezet, alsof iemand een checklist uit mijn handleiding oplas. De koelcel werd “de koude kamer” genoemd, alsof dat een naam was, en de handwasbak “de Hobart-spoelbak”. Wie dit ook heeft geschreven, wist precies waarop een commerciële keuken gepakt kan worden, wist het dondersgoed, en wist precies waar een oud pand zijn zwakke plekken heeft.’ Hij deed de deur open naar de kou. ‘Iemand die de wet zó goed kent, is doorgaans niet degene die de klacht indient. Die heeft meestal zijn eigen keuken om voor te zorgen.’</w:t>
+        <w:t xml:space="preserve"> Gevoel, meestal, half uit rancune voortkomend, en die rancune filter ik al op de stoep voordat ik mijn map opengooi.’ Hij zette zijn hoed recht. ‘Deze las niet zo. Die was getyped en noemde de subsecties bij naam. Er werd precies naar de norm voor de handwasbaktemperatuur verwezen, hoofdstuk en lid. Het voegwerk en de deurnaad werden met vaktermen aangeduid nog voordat ik ook maar een stap binnen had gezet, alsof iemand een checklist uit mijn handleiding oplas. De koelcel werd “de koude kamer” genoemd, alsof dat een naam was, en de handwasbak “de Hobart-spoelbak”. Wie dit ook heeft geschreven, wist precies waarop een commerciële keuken gepakt kan worden, wist het dondersgoed, en wist precies waar een oud pand zijn zwakke plekken heeft.’ Hij deed de deur open naar de kou. ‘Iemand die de wet zó goed kent, is doorgaans niet degene die de klacht indient. Die heeft meestal een eigen keuken om voor te zorgen.’</w:t>
       </w:r>
     </w:p>
     <w:p/>
@@ -2544,7 +2544,7 @@
     <w:p/>
     <w:p>
       <w:r>
-        <w:t xml:space="preserve">Greta stond bij de toonbank met het gele papier onder haar handen. Die waren versteend toen hij ‘de koude kamer’ had gezegd. Ik had het over zijn schouder meegelezen. Ze zei niets, en ik vroeg niets.</w:t>
+        <w:t xml:space="preserve">Greta stond bij de toonbank met het gele papier onder haar handen. Die waren versteend toen hij ‘de koude kamer’ had gezegd. Ik had het over zijn schouder heen gezien. Ze zei niets, en ik vroeg niets.</w:t>
       </w:r>
     </w:p>
     <w:p/>
@@ -2565,7 +2565,7 @@
     <w:p/>
     <w:p>
       <w:r>
-        <w:t xml:space="preserve">Er hing nog geen gezicht aan, alleen een valse noot, helder als een aangeslagen bel in de verkeerde toonsoort. Een feit dat bij geen van de drie namen paste die de vrouwen van de kring mij hadden toegeworpen, maar in plaats daarvan wees in de richting van iemand die het vak van binnenuit kende. Ik schoof die gedachte opzij naast de zure bloem en de gestalte bij de achterdeur in het donker, en zag het totaalplaatje nog niet voor me.</w:t>
+        <w:t xml:space="preserve">Er hing nog geen gezicht aan, alleen een valse noot, helder als een aangeslagen bel in de verkeerde toonsoort. Een feit dat bij geen van de drie namen paste die de vrouwen van de kring mij hadden toegeworpen, maar in plaats daarvan wees in de richting van iemand die het vak van binnenuit kende. Ik legde het in gedachten naast de zure bloem en de gestalte bij de achterdeur in het donker, en zag het totaalplaatje nog niet voor me.</w:t>
       </w:r>
     </w:p>
     <w:p>
@@ -2775,7 +2775,7 @@
     </w:p>
     <w:p>
       <w:r>
-        <w:t xml:space="preserve">Terwijl ik naar huis liep, zette ik het voor mezelf op een rij. Neem al dat rekenwerk voor waar. Stel dat er een man is die wanhopig genoeg is. Ik zal niet degene zijn die beweert dat armen te goed zijn om een misdaad te begaan, want dat is niets minder dan dezelfde oude wreedheid, maar dan in een liever jasje. Een wanhopige man zou een baksteen kunnen gooien. Hij zou, God vergeve het hem, in het donker een woord op een muur kunnen kalken en zichzelf de volgende ochtend haten. Dat lag binnen het bereik van een wanhopige man.</w:t>
+        <w:t xml:space="preserve">Terwijl ik naar huis liep, zette ik het voor mezelf op een rij. Neem al dat rekenwerk voor waar. Stel dat er een man is die wanhopig genoeg is. Ik zal niet degene zijn die beweert dat armen te goed zijn om een misdaad te begaan, want dat is niets anders dan dezelfde oude wreedheid, maar dan in een liever jasje. Een wanhopige man zou een baksteen kunnen gooien. Hij zou, God vergeve het hem, in het donker een woord op een muur kunnen kalken en zichzelf de volgende ochtend haten. Dat lag binnen het bereik van een wanhopige man.</w:t>
       </w:r>
     </w:p>
     <w:p>
@@ -2964,7 +2964,7 @@
     </w:p>
     <w:p>
       <w:r>
-        <w:t xml:space="preserve">Je kon geen zuurmiddel per zak kopen in de winkel van een kruidenier. Die kwam van een bakkersgroothandel, op rekening, bij mensen van wie bekend was dat ze in het vak zaten. Je kon het ook niet op het oog doseren. Een snufje te weinig werkte niet. Een schep te veel en de rauwe bloem rook direct scherp zodra de zak werd geopend, en elke bakker gooide de zak weg. Om haar te ruïneren en de bloem er goed genoeg uit te laten zien en te laten ruiken zodat ze vier keer zou bakken, vier keer achter elkaar in schone beslagen en met een verse zak gist terwijl ze zocht naar een fout die nooit in haar eigen handen lag, vergde kennis van precies de verkeerde dosering. Dat was vakkennis, niet de woede van een buurman. Het paste precies bij de getypte klacht waarin de subartikelen werden aangehaald, de hand die de norm voor de handwasbak uit het hoofd kende. Dezelfde wetenschap, nu tweemaal, in twee verschillende wapens.</w:t>
+        <w:t xml:space="preserve">Je kon geen zuurmiddel per zak kopen in de winkel van een kruidenier. Het kwam van een bakkersgroothandel, op rekening, bij mensen van wie bekend was dat ze in het vak zaten. Je kon het ook niet op het oog doseren. Een snufje te weinig werkte niet. Een schep te veel en de rauwe bloem rook direct scherp zodra de zak werd geopend, en elke bakker gooide de zak weg. Om haar te ruïneren en de bloem er goed genoeg uit te laten zien en te laten ruiken zodat ze vier keer zou bakken, vier keer achter elkaar in schone beslagen en met een verse zak gist terwijl ze zocht naar een fout die nooit in haar eigen handen lag, vergde kennis van precies de verkeerde dosering. Dat was vakkennis, niet de woede van een buurman. Het paste precies bij de getypte klacht waarin de subartikelen werden aangehaald, de hand die de norm voor de handwasbak uit het hoofd kende. Dezelfde wetenschap, nu tweemaal, in twee verschillende wapens.</w:t>
       </w:r>
     </w:p>
     <w:p>
@@ -2984,7 +2984,7 @@
     </w:p>
     <w:p>
       <w:r>
-        <w:t xml:space="preserve">Ik liep naar de brink in het vervagende blauwe licht, met de intentie recht naar huis te gaan, en de sneeuwman bij de apotheek was weer verplaatst. De grote menigte op de brink leunde nog steeds naar binnen naar hun warme, onzichtbare vuur, zo geduldig als altijd. Maar degene die daar al twee dagen in zijn eentje bij de mond van het steegje had gestaan, was in de duisternis van de afgelopen dag verschoven, en in plaats van met de rest naar de brink te leunen, leunde hij nu schuin de andere kant op, zijn kolengezicht en zijn hele vormeloze gewicht overhellend naar de achterkant van de winkels aan Evergreen.</w:t>
+        <w:t xml:space="preserve">Ik liep naar de brink in het vervagende blauwe licht, met de intentie recht naar huis te gaan, en de sneeuwman bij de apotheek had zich weer verplaatst. De grote menigte op de brink leunde nog steeds naar binnen naar hun warme, onzichtbare vuur, zo geduldig als altijd. Maar degene die daar al twee dagen in zijn eentje bij de mond van het steegje had gestaan, was in de duisternis van de afgelopen dag verschoven, en in plaats van met de rest naar de brink te leunen, leunde hij nu schuin de andere kant op, zijn kolengezicht en zijn hele vormeloze gewicht overhellend naar de achterkant van de winkels aan Evergreen.</w:t>
       </w:r>
     </w:p>
     <w:p>
@@ -3049,7 +3049,7 @@
     <w:p/>
     <w:p>
       <w:r>
-        <w:t>Dat was alles wat ervoor nodig was. Ik draaide mijn kopje rond en vond het maar niks hoe eenvoudig het was. Greta was om vier uur op en zat onder de bloem, beide handen in een rijsend deeg of op een hete bakplaat, de oven bulderde en de achterkamer was bedompt door de hitte. Ze gooide die deur open naar de steeg voor de frisse lucht en de weldaad van een koude tocht op een bakker die al sinds het donker bij de ovens stond. Het was slechts de nuchtere gang van zaken in een werkende winkel. Maar tot aan de baksteen betekende dat dat er twee uur lang elke duistere ochtend een deur openstond naar die steeg. Een vrouw aan de overkant daarvan, handen vol deeg, haar rug naar de kou. En daartussenin een bak bloem waar helemaal niemand op lette.</w:t>
+        <w:t xml:space="preserve">Dat was alles wat ervoor nodig was. Ik draaide mijn kopje rond en vond het maar niks hoe eenvoudig het was. Greta was om vier uur op en zat onder de bloem, beide handen in een rijsend deeg of op een hete bakplaat, de oven bulderde en de achterkamer was bedompt door de hitte. Ze gooide die deur open naar de steeg voor de frisse lucht en de weldaad van een koude tocht op een bakker die al sinds het donker bij de ovens stond. Het was slechts de nuchtere gang van zaken in een werkende winkel. Maar tot aan de baksteen betekende dat dat er twee uur lang elke duistere ochtend een deur openstond naar die steeg. Een vrouw aan de andere kant ervan, handen vol deeg, haar rug naar de kou. En daartussenin een bak bloem waar helemaal niemand op lette.</w:t>
       </w:r>
     </w:p>
     <w:p/>
@@ -3079,7 +3079,7 @@
     <w:p/>
     <w:p>
       <w:r>
-        <w:t xml:space="preserve">De steeg achter de winkels aan Evergreen liep over de hele lengte van het huizenblok, een geruimde sleuf tussen de achterkant van de winkels en de lage muur van de percelen erachter. Breed genoeg voor die ene bestelbus en niet meer. Ik liep er langzaam doorheen in het vlakke ochtendlicht, Pip aan mijn hiel, stil en behoedzaam geworden, en las de achterkant van de winkels zoals ik nooit de moeite had genomen te doen. Als deuren in plaats van muren. Hier was de stalen deur van de apotheek, op slot gehouden, met een bel erop. En hier de twee die het laadperron deelden. Petes koelopslag, een oude uit blokken opgetrokken ruimte met een zware grendel, en het tweede hangslot dat hij pas geleden helder en nieuw van Tom had gekocht op de poort. En drie deuren verderop die van Greta, laag en van hout, bij de klink bleek afgesleten door veertig jaar van een hand vol bloem.</w:t>
+        <w:t xml:space="preserve">De steeg achter de winkels aan Evergreen liep over de hele lengte van het huizenblok, een geruimde sleuf tussen de achterkant van de winkels en de lage muur van de percelen erachter. Breed genoeg voor die ene bestelbus en niet meer. Ik liep er langzaam doorheen in het vlakke ochtendlicht, Pip aan mijn hiel, stil en behoedzaam geworden, en las de achterkant van de winkels zoals ik nooit de moeite had genomen te doen. Als deuren in plaats van muren. Hier was de stalen deur van de apotheek, op slot gehouden, met een bel erop. En hier de twee die het laadperron deelden. Petes koelopslag, een oude uit blokken opgetrokken ruimte met een zware grendel, en aan de poort het tweede hangslot dat hij van Tom had gekocht, helder en nieuw. En drie deuren verderop die van Greta, laag en van hout, bij de klink bleek afgesleten door veertig jaar van een hand vol bloem.</w:t>
       </w:r>
     </w:p>
     <w:p/>
@@ -3091,7 +3091,7 @@
     <w:p/>
     <w:p>
       <w:r>
-        <w:t xml:space="preserve">En het was bereikbaar. Dat was het pijnlijke eraan. Geen kluis. Een houten deur in een openbare steeg die tot aan de baksteen elke ochtend half had opengestaan. Iedereen die de uren van een bakker kende en een reden had om voor dag en dauw in dat erf te zijn, kon ongezien naar deze drempel lopen. Een erf zo druk als Pete zelf al had gezegd, stond vol sporen en bood geen antwoorden. De sneeuw rond Greta’s treden was tot drab vertrapt en weer bevroren, laars op laars op laars, die van de bezorger, de hare, van de sneeuwruimer, en God mag weten wie nog meer. Honderd voetafdrukken. Geen daarvan een naam.</w:t>
+        <w:t xml:space="preserve">En het was bereikbaar. Dat was het pijnlijke eraan. Geen kluis. Een houten deur in een openbare steeg die tot aan de baksteen elke ochtend half had opengestaan. Iedereen die de uren van een bakker kende en een reden had om voor dag en dauw in dat erf te zijn, kon ongezien naar deze drempel lopen. Een erf dat zo druk was, had Pete zelf al gezegd, stond vol sporen en bood geen antwoorden. De sneeuw rond Greta’s treden was tot drab vertrapt en weer bevroren, laars op laars op laars, die van de bezorger, de hare, van de sneeuwruimer, en God mag weten wie nog meer. Honderd voetafdrukken. Geen daarvan een naam.</w:t>
       </w:r>
     </w:p>
     <w:p/>
@@ -3175,7 +3175,7 @@
     <w:p/>
     <w:p>
       <w:r>
-        <w:t>Maar het was vooral Petes deuropening. En de wetenschap vergde niet meer dan een nacht om te vergaren, en het geld was voor een slager die in de boeken van leveranciers stond zo onwaarschijnlijk nog niet eens. En ik kon, staande in die koude steeg, de geruststelling dat toegang niet alles was niet groot genoeg maken om het onbehagen te dekken over wie er zo recht in de deuropening stond.</w:t>
+        <w:t xml:space="preserve">Maar het was vooral Petes deuropening. En de wetenschap vergde niet meer dan een nacht om te vergaren, en aan geld ontbrak het een slager die bij leveranciers op de rol stond nu ook weer niet zo duidelijk. En ik kon, staande in die koude steeg, de geruststelling dat toegang niet alles was niet groot genoeg maken om het onbehagen te dekken over wie er zo recht in de deuropening stond.</w:t>
       </w:r>
     </w:p>
     <w:p/>
@@ -3187,7 +3187,7 @@
     <w:p/>
     <w:p>
       <w:r>
-        <w:t xml:space="preserve">‘Ik vind ook niet leuk waar de kaart naar wijst,’ zei ik. Ik keek nog een laatste maal naar de koude keel van het laadperron, naar Greta’s lage deur die tot aan de baksteen elke duistere ochtend half had opengestaan, en drie deuren verder naar de poort van de slager waar een goed man alle reden van de wereld had om er voor dag en dauw te zijn. ‘Vorige week mocht ik hem liever. Toen was het alleen een ketting en wat geschreeuw. Met toegang loop je niet zo makkelijk langs iemand heen.’</w:t>
+        <w:t xml:space="preserve">‘Ik vind ook niet leuk waar de kaart naar wijst,’ zei ik. Ik keek nog een laatste maal naar de koude keel van het laadperron, naar Greta’s lage deur die tot aan de baksteen elke duistere ochtend half had opengestaan, en drie deuren verder naar de poort van de slager waar een goed man alle reden van de wereld had om er voor dag en dauw te zijn. ‘Vorige week mocht ik hem liever. Toen was het alleen een ketting en wat geschreeuw. Toegang is een stuk lastiger weg te redeneren.’</w:t>
       </w:r>
     </w:p>
     <w:p/>
@@ -3208,7 +3208,7 @@
         <w:t xml:space="preserve">Wendt’s Bakehouse, Bridgton</w:t>
       </w:r>
       <w:r>
-        <w:t xml:space="preserve"> op de zijkant. Joyce Wendt kwam erachter vandaan met een ovenschaal in een theedoek, aluminiumfolie over de rand geklemd, en liep over de vastgetreden sneeuw naar Greta’s deur. Het rolluik was omlaag. Joyce klopte met haar elleboog.</w:t>
+        <w:t xml:space="preserve"> op de zijkant. Joyce Wendt kwam erachter vandaan met een ovenschaal in een theedoek, aluminiumfolie over de rand geklemd, en liep over de vastgetreden sneeuw naar Greta’s deur. Het rolgordijn was omlaag. Joyce klopte met haar elleboog.</w:t>
       </w:r>
     </w:p>
     <w:p/>
@@ -3232,7 +3232,7 @@
     <w:p/>
     <w:p>
       <w:r>
-        <w:t>Ik vond het een lief gebaar, een warme schaal eten die helemaal vanuit Bridgton was gereden voor een vrouw die vorige week nog één enkel woord over de toonbank had gegooid.</w:t>
+        <w:t xml:space="preserve">Ik vond het een lief gebaar, een warme schaal eten die helemaal vanuit Bridgton was gereden voor een vrouw die haar vorige week over de toonbank nog maar één woord had gegund.</w:t>
       </w:r>
     </w:p>
     <w:p/>
@@ -3267,19 +3267,19 @@
     <w:p/>
     <w:p>
       <w:r>
-        <w:t xml:space="preserve">En Pete Garcia was een slager. Hij kende een runderhelft tot op een haar, en zou een zuurmiddel net zo min van een laagje krijt kunnen onderscheiden als ik zou weten hoe je een stier moest uitbenen. Hij kon elke zwarte ochtend van zijn leven voor haar open deur gaan staan en nog steeds dat ene ontbreken dat de misdaad definieerde. Het weten wat je ervoor moest meenemen.</w:t>
-      </w:r>
-    </w:p>
-    <w:p/>
-    <w:p>
-      <w:r>
-        <w:t xml:space="preserve">Ik haalde de ketel van het vuur. Ik had die koude lijn naar zijn poort getrokken op basis van toegang alleen, en toegang, had ik mezelf in de steeg gezegd, was een deuropening en geen vonnis. Hij stond pal in de deuropening, ja. Maar de kamer daarachter herbergde een aard die hij niet had en een stiel die hij niet kende.</w:t>
-      </w:r>
-    </w:p>
-    <w:p/>
-    <w:p>
-      <w:r>
-        <w:t xml:space="preserve">‘Hij heeft het niet gedaan,’ zei ik, en deze keer liet ik de woorden ‘ik denk het niet’ achterwege. Ik had die kortere zin wel verdiend.</w:t>
+        <w:t xml:space="preserve">En Pete Garcia was een slager. Hij kende een runderhelft tot op een haar, en zou een zuurmiddel net zo min van een laagje krijt kunnen onderscheiden als ik zou weten hoe je een stier moest uitbenen. Hij kon elke zwarte ochtend van zijn leven voor haar open deur gaan staan en nog steeds dat ene missen dat de misdaad definieerde. Het weten wat je ervoor moest meenemen.</w:t>
+      </w:r>
+    </w:p>
+    <w:p/>
+    <w:p>
+      <w:r>
+        <w:t xml:space="preserve">Ik haalde de ketel van het vuur. Ik had die koude lijn naar zijn poort getrokken op basis van toegang alleen, en toegang, had ik mezelf in de steeg gezegd, was een deuropening en geen vonnis. Hij stond pal in de deuropening, ja. Maar de kamer daarachter herbergde een aard die hij niet had en een vak dat hij niet kende.</w:t>
+      </w:r>
+    </w:p>
+    <w:p/>
+    <w:p>
+      <w:r>
+        <w:t xml:space="preserve">‘Hij heeft het niet gedaan,’ zei ik, en deze keer liet ik de woorden ‘ik denk niet’ achterwege. Ik had die kortere zin wel verdiend.</w:t>
       </w:r>
     </w:p>
     <w:p/>
@@ -3333,13 +3333,13 @@
     <w:p/>
     <w:p>
       <w:r>
-        <w:t xml:space="preserve">‘Dat postuur waar ik je over vertelde,’ zei hij, terwijl hij de kotelet inpakte waar ik niet om had gevraagd. ‘Bij haar achterdeur in het donker. Dat wil je nu zeker allemaal weten, nu je me gelooft.’ Hij legde zijn grote handen plat op het blok en keek door zijn raam naar de winkelpuien van Evergreen aan de overkant van de brink, alsof hij er dwars doorheen kon kijken naar het erf. ‘Een volwassene. Geen jochie, wat het dorp ook wil ophangen aan een of andere snotneus met een verfbus. Langer dan Greta, en doelgericht in beweging. Niet slenteren. Geen handen warmen. Die wist heel goed waarom die er was. En bedekt. Een lange jas, of een stofjas, losvallend, van dat type waar je in werkt zodat je niet onder de vlekken komt te zitten, bleek, zou ik bijna zeggen, hoewel het donker de kleur opslokte. Dicht tegen haar muur aan, waar de leveringen komen en geen fatsoenlijk mens iets te zoeken heeft. En toen mijn koplampen om de hoek schenen was die weg, snel en stil, geen vlucht maar een vertrek. Zonder haast. Klaar en weg.’ Hij schudde zijn grijze hoofd. ‘Geen gezicht. Er was nooit een gezicht te bekennen. Alleen een werkend postuur, erop uit om niet gezien te worden, dat Greta’s uren beter kende dan een vreemde mocht.’ Hij knoopte het papier dicht. ‘Dat busje ook, op een ochtend. Geparkeerd bij de apotheek, motor tikkend. Hoog van dak, hoger dan een busje nodig heeft, met een strook rode reflecterende tape over de achterdeuren. Die lichtte op als een kerstboom toen mijn koplampen erop vielen.’</w:t>
-      </w:r>
-    </w:p>
-    <w:p/>
-    <w:p>
-      <w:r>
-        <w:t xml:space="preserve">Ik sloeg het op, elk woord. Een volwassen postuur met een doel, in een losse, bleke werkjas, voor dag en dauw, bij de enige deur die een wetende hand kon bereiken. Geen jongen, en geen driftkop.</w:t>
+        <w:t xml:space="preserve">‘Die gestalte waar ik je over vertelde,’ zei hij, terwijl hij de kotelet inpakte waar ik niet om had gevraagd. ‘Bij haar achterdeur in het donker. Dat wil je nu zeker allemaal weten, nu je me gelooft.’ Hij legde zijn grote handen plat op het blok en keek door zijn raam naar de winkelpuien van Evergreen aan de overkant van de brink, alsof hij er dwars doorheen kon kijken naar het erf. ‘Een volwassene. Geen jochie, wat het dorp ook wil ophangen aan een of andere snotneus met een verfbus. Langer dan Greta, en doelgericht in beweging. Niet slenteren. Geen handen warmen. Die wist heel goed waarom die er was. En bedekt. Een lange jas, of een stofjas, losvallend, van dat type waar je in werkt zodat je niet onder de vlekken komt te zitten, bleek, zou ik bijna zeggen, hoewel het donker de kleur opslokte. Dicht tegen haar muur aan, waar de leveringen komen en geen fatsoenlijk mens iets te zoeken heeft. En toen mijn koplampen om de hoek schenen was die weg, snel en stil, geen vlucht maar een vertrek. Zonder haast. Klaar en weg.’ Hij schudde zijn grijze hoofd. ‘Geen gezicht. Er was nooit een gezicht te bekennen. Alleen een werkende gestalte, erop uit om niet gezien te worden, die Greta’s uren beter kende dan een vreemde mocht.’ Hij knoopte het papier dicht. ‘Dat busje ook, op een ochtend. Geparkeerd bij de apotheek, motor tikkend. Hoog van dak, hoger dan een busje nodig heeft, met een strook rode reflecterende tape over de achterdeuren. Die lichtte op als een kerstboom toen mijn koplampen erop vielen.’</w:t>
+      </w:r>
+    </w:p>
+    <w:p/>
+    <w:p>
+      <w:r>
+        <w:t xml:space="preserve">Ik sloeg het op, elk woord. Een volwassen gestalte met een doel, in een losse, bleke werkjas, voor dag en dauw, bij de enige deur die een wetende hand kon bereiken. Geen jongen, en geen driftkop.</w:t>
       </w:r>
     </w:p>
     <w:p/>
@@ -3357,7 +3357,7 @@
     <w:p/>
     <w:p>
       <w:r>
-        <w:t>Daar stond de hele man, samengevat in een zin waarvan hij nog liever gestorven was dan hem vriendelijk te noemen. De wrok die ’s middags luid werd uitgedragen, en daaronder een stugge hand die een postuur wegjoeg bij de deur van een vrouw tegen wie hij geen woord sprak, zonder dat aan iemand te vertellen, omdat je onder een slechte naam geen dank krijgt voor het goede dat je in het donker verricht.</w:t>
+        <w:t xml:space="preserve">Daar stond de hele man, samengevat in een zin waarvan hij nog liever gestorven was dan hem vriendelijk te noemen. De wrok die ’s middags luid werd uitgedragen, en daaronder een stugge hand die een gestalte wegjoeg bij de deur van een vrouw tegen wie hij geen woord sprak, zonder dat aan iemand te vertellen, omdat je onder een slechte naam geen dank krijgt voor het goede dat je in het donker verricht.</w:t>
       </w:r>
     </w:p>
     <w:p/>
@@ -3500,7 +3500,7 @@
     <w:p/>
     <w:p>
       <w:r>
-        <w:t xml:space="preserve">Hij vertelde het me. Hij was thuis geweest. Zijn vader had die week de nachtdienst in de fabriek geloot, en zijn moeder had extra schoonmaakwerk op school aangenomen, dus Danny zat ’s nachts op met zijn zusjes, want je kunt een kind van zes niet om twee uur ’s nachts alleen achterlaten. Hij was de hele nacht dat de muur werd gedaan in zijn keuken geweest, met een ziek zusje en een koortsthermometer en het nummer van de fabriek bij de telefoon voor het geval de koorts zou stijgen. Hij gaf me er te veel van en allemaal de verkeerde details, de temperatuur, de smaak van de hoestbonbons, en het klonk als de waarheid.</w:t>
+        <w:t xml:space="preserve">Hij vertelde het me. Hij was thuis geweest. Zijn vader had die week de nachtdienst in de fabriek gekregen, en zijn moeder had extra schoonmaakwerk op school aangenomen, dus Danny zat ’s nachts op met zijn zusjes, want je kunt een kind van zes niet om twee uur ’s nachts alleen achterlaten. Hij was de hele nacht dat de muur werd gedaan in zijn keuken geweest, met een ziek zusje en een koortsthermometer en het nummer van de fabriek bij de telefoon voor het geval de koorts zou stijgen. Hij gaf me er te veel van en allemaal de verkeerde details, de temperatuur, de smaak van de hoestbonbons, en het klonk als de waarheid.</w:t>
       </w:r>
     </w:p>
     <w:p/>
@@ -3512,7 +3512,7 @@
     <w:p/>
     <w:p>
       <w:r>
-        <w:t xml:space="preserve">‘Vraag het haar.’ Hij keek naar zijn handen. ‘Vraag het de Petersens twee huizen verderop. Zij hadden mijn zusjes voor dat uur dat ik naar de apotheek rende voordat die dichtging. Ik kan niet op twee plekken tegelijk zijn. Ik probeer het de mensen steeds te vertellen, en ze hebben hun oordeel al geveld.’ De bitterheid kwam jong en rauw naar boven. ‘Omdat Greta me heeft laten gaan. Alsof ik dat bij al die winkels op háár muur zou kalken. Ze is goed voor me geweest. Ze is de enige hier beneden die me altijd netjes op tijd heeft betaald en me nooit heeft genaaid.’</w:t>
+        <w:t xml:space="preserve">‘Vraag het haar.’ Hij keek naar zijn handen. ‘Vraag het de Petersens twee huizen verderop. Zij hadden mijn zusjes voor dat uur dat ik naar de apotheek rende voordat die dichtging. Ik kan niet op twee plekken tegelijk zijn. Ik probeer het de mensen steeds te vertellen, en ze hebben hun oordeel al geveld.’ De bitterheid kwam jong en rauw naar boven. ‘Omdat Greta me heeft laten gaan. Alsof ik dat bij al die winkels op háár muur zou kalken. Ze is goed voor me geweest. Ze is de enige hier beneden die me altijd netjes op tijd heeft betaald en me nooit een cent te weinig heeft gegeven.’</w:t>
       </w:r>
     </w:p>
     <w:p/>
@@ -3752,7 +3752,7 @@
     <w:p/>
     <w:p>
       <w:r>
-        <w:t xml:space="preserve">Het gesprek ging over het kerkdiner en of Tom het onderdeel voor de stadssneeuwblazer al binnen had. Daartussen leunde Martha vanuit de stoel naast me naar voren en sprak zachtjes, alleen voor mij.</w:t>
+        <w:t xml:space="preserve">Het gesprek ging over het kerkdiner en of Tom het onderdeel voor de sneeuwblazer van de gemeente al binnen had. Daartussen leunde Martha vanuit de stoel naast me naar voren en sprak zachtjes, alleen voor mij.</w:t>
       </w:r>
     </w:p>
     <w:p/>
@@ -3782,7 +3782,7 @@
     <w:p/>
     <w:p>
       <w:r>
-        <w:t xml:space="preserve">‘Goed.’ Martha breide haar toer af. ‘Ze zal het nodig hebben om iemand dat te horen zeggen.’</w:t>
+        <w:t xml:space="preserve">‘Goed.’ Martha breide haar toer af. ‘Ze heeft het nodig dat iemand dat tegen haar zegt.’</w:t>
       </w:r>
     </w:p>
     <w:p/>
@@ -3804,7 +3804,7 @@
     </w:p>
     <w:p>
       <w:r>
-        <w:t>De dorpszaal was opengegooid voor de twee inzamelingen tegelijk, die van Hal en die van het Genootschap, en de mensen van Frost Falls waren uit de kou gekomen om ze allebei te vullen. Hal stond bij de voedseltonnen aan de ene kant in zijn nette jas, verlegen geworden door de enorme opkomst. Hij nam blikken en knolgewassen in ontvangst, en van een vrouw die het zich nauwelijks kon veroorloven een hele ham. Hij schreef van niemand een naam op. Alleen een telling. Mensen die stil en behoedzaam waren geworden sinds Gretas ellende was begonnen, waren nu losgebarsten. Ze stonden in een warme, luidruchtige zaal hun wintervoorraad weg te geven aan buren wier namen ze nooit zouden mogen vernemen. Pip liep één keer de rij tonnen langs, vond de sardines in de tweede en bleef er uit protest bovenstaan.</w:t>
+        <w:t xml:space="preserve">De dorpszaal was opengegooid voor de twee inzamelingen tegelijk, die van Hal en die van het Genootschap, en de mensen van Frost Falls waren uit de kou gekomen om ze allebei te vullen. Hal stond bij de voedseltonnen aan de ene kant in zijn nette jas, verlegen geworden door de enorme opkomst. Hij nam blikken en knolgewassen in ontvangst, en van een vrouw die het zich nauwelijks kon veroorloven een hele ham. Hij schreef van niemand een naam op. Alleen een telling. Mensen die stil en behoedzaam waren geworden sinds Gretas ellende was begonnen, waren nu weer opengebloeid. Ze stonden in een warme, luidruchtige zaal hun wintervoorraad weg te geven aan buren wier namen ze nooit zouden mogen vernemen. Pip liep één keer de rij tonnen langs, vond de sardines in de tweede en bleef er uit protest bovenstaan.</w:t>
       </w:r>
     </w:p>
     <w:p>
@@ -3839,7 +3839,7 @@
     </w:p>
     <w:p>
       <w:r>
-        <w:t xml:space="preserve">‘Neem er twee. Er is meer waar dat vandaan komt.’ Ze draaide zich om en zag mij naast zich staan. ‘Jessica. Hoe is het met haar?’</w:t>
+        <w:t xml:space="preserve">‘Neem er twee. Er komt nog meer.’ Ze draaide zich om en zag mij naast zich staan. ‘Jessica. Hoe is het met haar?’</w:t>
       </w:r>
     </w:p>
     <w:p>
@@ -4038,7 +4038,7 @@
     </w:p>
     <w:p>
       <w:r>
-        <w:t xml:space="preserve">Doc had gezegd dat een banketbakkerij geen nut zou hebben voor het spul in Gretas bak. Maar zij zat in de handel, met een rekening bij een groothandel in Portland die haar zou opsturen wat ze ook maar op het bestelformulier schreef. De baksteen op Gretas tegels had oude grijze mortel erop, en de enige hoop oude baksteen op het blok lag in de container achter haar winkel. En daar was de week, in mijn hand. Doc had hier niet gestaan en haar niet gehoord.</w:t>
+        <w:t xml:space="preserve">Doc had gezegd dat een banketbakkerij geen nut zou hebben voor het spul in Gretas bak. Maar zij zat in het vak, met een rekening bij een groothandel in Portland die haar zou opsturen wat ze ook maar op het bestelformulier schreef. De baksteen op Gretas tegels had oude grijze mortel erop, en de enige hoop oude baksteen op het blok lag in de container achter haar winkel. En daar was de week, in mijn hand. Doc had hier niet gestaan en haar niet gehoord.</w:t>
       </w:r>
     </w:p>
     <w:p>
@@ -4228,7 +4228,7 @@
     <w:p/>
     <w:p>
       <w:r>
-        <w:t xml:space="preserve">‘Het is mijn vak.’ Ze zei het zonder met haar ogen te knipperen. ‘Je weet precies waar een commerciële keuken voor op de vingers wordt getikt, net zoals je de onderdelen van je auto kent. De temperaturen, de afdichtingen, het water. Dat is de saaie helft van het werk, en de helft die je de kop kost als je het verwaarloost.’ Ze glimlachte, innemend en onaantastbaar, zonder een kiertje waar ik een vinger tussen kon krijgen. ‘Ik heb in drie steden inspecties doorstaan. Je leert de regels uit je hoofd. Of je overleeft het niet. Ik hoop echt dat ze er bovenop komt. Het is een harde wereld, als je wordt verslagen door je eigen afvoerbuizen.’</w:t>
+        <w:t xml:space="preserve">‘Het is mijn vak.’ Ze zei het zonder met haar ogen te knipperen. ‘Je weet precies waar een commerciële keuken voor op de vingers wordt getikt, net zoals je de onderdelen van je auto kent. De temperaturen, de afdichtingen, het water. Dat is de saaie helft van het werk, en de helft die je de kop kost als je het verwaarloost.’ Ze glimlachte, innemend en onaantastbaar, zonder een kiertje waar ik een vinger tussen kon krijgen. ‘Ik heb in drie steden inspecties doorstaan. Je leert de regels uit je hoofd. Of je overleeft het niet. Ik hoop echt dat ze er bovenop komt. Het is een harde wereld, als je wordt verslagen door je eigen leidingen.’</w:t>
       </w:r>
     </w:p>
     <w:p/>
@@ -4240,7 +4240,7 @@
     <w:p/>
     <w:p>
       <w:r>
-        <w:t xml:space="preserve">En op grond van het bewijs zouden ze nog gelijk hebben gehad ook. Weten van het voegwerk was nog geen poeder strooien. Ze had me haar erkenning gegeven en verder absoluut niets waar ik iets mee kon, en ik vermoedde dat ze onder haar medelijden heel goed wist hoe weinig ik uit haar winkel kon meenemen.</w:t>
+        <w:t xml:space="preserve">En op grond van het bewijs zouden ze nog gelijk hebben gehad ook. Weten van het voegwerk was nog geen poeder strooien. Ze had me het moment van herkenning gegund en verder absoluut niets waar ik iets mee kon, en ik vermoedde dat ze onder haar medelijden heel goed wist hoe weinig ik uit haar winkel kon meenemen.</w:t>
       </w:r>
     </w:p>
     <w:p/>
@@ -4282,7 +4282,7 @@
     <w:p/>
     <w:p>
       <w:r>
-        <w:t xml:space="preserve">Eenmaal thuis haalde ik de balsemden uit de schuur en legde de ring op de keukentafel. Pip legde haar kroonkurk op de vensterbank en draaide hem tweemaal tot het naar haar zin lag. Ik knipte een stuk goudlint af voor Renée’s strik en legde dat apart, en ik bond het eerste bosje balsemden vast aan de ring voor de deur van Sugarplum en trok het ijzerdraad strak aan.</w:t>
+        <w:t xml:space="preserve">Eenmaal thuis haalde ik de balsemden uit de schuur en legde de ring op de keukentafel. Pip legde haar kroonkurk op de vensterbank en draaide hem tweemaal tot hij naar haar zin lag. Ik knipte een stuk goudlint af voor Renée’s strik en legde dat apart, en ik bond het eerste bosje balsemden vast aan de ring voor de deur van Sugarplum en trok het ijzerdraad strak aan.</w:t>
       </w:r>
     </w:p>
     <w:p>
@@ -4299,13 +4299,13 @@
     <w:p/>
     <w:p>
       <w:r>
-        <w:t>Ik trof hem even voor twaalven bij de apotheek. Het was een vroege sluitingsdag op de middelbare school, en hij kocht hoestdrank en honingsnoepjes, van dat soort waar een huis vol zieke zussen in een slechte week doorheen joeg. Hij hield zijn schouders nog steeds gespannen. Dat ontspande toen hij zag wie ik was, en het ontspande nog eens toen Pip om het uiteinde van het pad kwam waggelen en hem met haar hoofd scheef opzij opnam, net zoals ze op de brink had gedaan.</w:t>
-      </w:r>
-    </w:p>
-    <w:p/>
-    <w:p>
-      <w:r>
-        <w:t xml:space="preserve">‘Ze zijn gestopt,’ zei hij, nog voor ik het kon vragen. ‘Die blikken. Wat u ook tegen mevrouw Bennett hebt gezegd, het is rondgegaan. Een vrouw op school heeft recht tegen mijn moeder gezegd dat ik het onmogelijk kan zijn geweest.’ Hij keek naar de honingsnoepjes in plaats van naar mij. ‘Dus. Bedankt. Ik weet dat u het was.’</w:t>
+        <w:t xml:space="preserve">Ik trof hem even voor twaalven bij de apotheek. De middelbare school had die dag maar een halve dag, en hij kocht hoestdrank en honingsnoepjes, van dat soort waar een huis vol zieke zussen in een slechte week doorheen joeg. Hij hield zijn schouders nog steeds gespannen. Die ontspanden toen hij zag wie ik was, en ze ontspanden nog eens toen Pip om het uiteinde van het pad kwam waggelen en hem met haar hoofd scheef opzij opnam, net zoals ze op de brink had gedaan.</w:t>
+      </w:r>
+    </w:p>
+    <w:p/>
+    <w:p>
+      <w:r>
+        <w:t xml:space="preserve">‘Ze zijn gestopt,’ zei hij, nog voor ik het kon vragen. ‘Die blikken. Wat u ook tegen mevrouw Bennett hebt gezegd, het is rondgegaan. Een vrouw op school heeft ronduit tegen mijn moeder gezegd dat ik het onmogelijk kan zijn geweest.’ Hij keek naar de honingsnoepjes in plaats van naar mij. ‘Dus. Bedankt. Ik weet dat u het was.’</w:t>
       </w:r>
     </w:p>
     <w:p/>
@@ -4317,7 +4317,7 @@
     <w:p/>
     <w:p>
       <w:r>
-        <w:t>Hij had een halfuur. Zijn vader was thuis en zat bij de meisjes. Ik nam hem mee naar de Starlight, en Kelly bracht de bekers chocomel naar het tafeltje bij het raam en ging weer terug naar haar toonbank zonder iets te vragen. Pip ging onder de tafel tegen zijn enkel liggen en draaide haar kopje elke keer dat het papieren zakje met honingsnoepjes ritselde achter het zakje aan.</w:t>
+        <w:t xml:space="preserve">Hij had een halfuur. Zijn vader was thuis en zat bij de meisjes. Ik nam hem mee naar de Starlight, en Kelly bracht de bekers chocomel naar het tafeltje bij het raam en ging weer terug naar haar toonbank zonder iets te vragen. Pip ging onder de tafel tegen zijn enkel liggen en draaide haar kop elke keer dat het papieren zakje met honingsnoepjes ritselde achter het zakje aan.</w:t>
       </w:r>
     </w:p>
     <w:p/>
@@ -4347,7 +4347,7 @@
     <w:p/>
     <w:p>
       <w:r>
-        <w:t xml:space="preserve">‘Er is nog iets anders,’ zei hij. ‘Datgene wat u me vroeg te onthouden. Het is weer bovenwater gekomen.’ Hij keek niet op van zijn kopje. ‘Die nachten dat ik voor Rosie opbleef, ging ik voor de frisse lucht bij het keukenraam staan. Ons huis grenst aan de achterterreinen achter de winkels. Je kunt het steegje vanaf ons raam zien wanneer het licht brandt boven Petes koelopslag.’</w:t>
+        <w:t xml:space="preserve">‘Er is nog iets anders,’ zei hij. ‘Datgene wat u me vroeg te onthouden. Het is weer boven water gekomen.’ Hij keek niet op van zijn kopje. ‘Die nachten dat ik voor Rosie opbleef, ging ik voor de frisse lucht bij het keukenraam staan. Ons huis grenst aan de achterterreinen achter de winkels. Je kunt het steegje vanaf ons raam zien wanneer het licht brandt boven Petes koelopslag.’</w:t>
       </w:r>
     </w:p>
     <w:p/>
@@ -4395,7 +4395,7 @@
     <w:p/>
     <w:p>
       <w:r>
-        <w:t xml:space="preserve">‘Mooi zo,’ zei hij. ‘Ze is altijd eerlijk tegen mij geweest. Als het haar helpt, heb ik dat liever dan er zomaar met een schone lei vanaf te komen.’</w:t>
+        <w:t xml:space="preserve">‘Mooi zo,’ zei hij. ‘Ze is altijd eerlijk tegen mij geweest. Als het haar helpt, heb ik dat liever dan dat ik alleen zelf vrijuit ga.’</w:t>
       </w:r>
     </w:p>
     <w:p/>
@@ -4425,7 +4425,7 @@
     <w:p/>
     <w:p>
       <w:r>
-        <w:t xml:space="preserve">‘Ik wil dat je met me meeloopt naar de laan,’ zei ik. ‘Naar Sugarplum. Ik ga Renée Duval vragen om mij haar voorraad te laten zien, en ik wil iemand daarbij hebben die een zuurmiddel herkent als hij er een tegenkomt. Iemand die eerlijk is, dokter. Voor het geval ik het mis heb.’</w:t>
+        <w:t xml:space="preserve">‘Ik wil dat je met me meeloopt naar de laan,’ zei ik. ‘Naar Sugarplum. Ik ga Renée Duval vragen om mij haar voorraad te laten zien, en ik wil iemand daarbij hebben die een zuurmiddel herkent als hij er een tegenkomt. Iemand die eerlijk is, Doc. Voor het geval ik het mis heb.’</w:t>
       </w:r>
     </w:p>
     <w:p/>
@@ -4497,13 +4497,13 @@
     <w:p/>
     <w:p>
       <w:r>
-        <w:t xml:space="preserve">Pip bleef stilstaan op de schoongeveegde stoep van Sugarplum, waar ze die ochtend en ook op de eerste dag had gewacht, volgens Renée’s regels. De dokter stond even naast haar om de sneeuw van zijn laarzen te kloppen, en zij nam het uiteinde van zijn schoenveter in haar snavel en trok die langzaam los. Hij keek naar haar neer en liet het zo.</w:t>
-      </w:r>
-    </w:p>
-    <w:p/>
-    <w:p>
-      <w:r>
-        <w:t>Renée kwam uit de achterste ruimte toen de deur achter ons in het slot viel. Ze zag mij, en toen de dokter, en de glimlach die ze tevoorschijn had geheald voor een klant verstijfde op haar gezicht.</w:t>
+        <w:t xml:space="preserve">Pip bleef stilstaan op de schoongeveegde stoep van Sugarplum, waar ze die ochtend en ook op de eerste dag had gewacht, volgens Renée’s regels. Doc stond even naast haar om de sneeuw van zijn laarzen te kloppen, en zij nam het uiteinde van zijn schoenveter in haar snavel en trok die langzaam los. Hij keek naar haar neer en liet het zo.</w:t>
+      </w:r>
+    </w:p>
+    <w:p/>
+    <w:p>
+      <w:r>
+        <w:t xml:space="preserve">Renée kwam uit de achterste ruimte toen de deur achter ons in het slot viel. Ze zag mij, en toen Doc, en de glimlach die ze tevoorschijn had gehaald voor een klant verstijfde op haar gezicht.</w:t>
       </w:r>
     </w:p>
     <w:p/>
@@ -4563,7 +4563,7 @@
     <w:p/>
     <w:p>
       <w:r>
-        <w:t xml:space="preserve">Ze bleef bij de deur staan met haar armen over elkaar geslagen terwijl de dokter de ruimte doorzocht. Hij deed het zoals hij een schuur zou hebben doorzocht: langzaam, alles bekijkend, zonder haast voor iemands gevoelens. Zakken bloem uit de groothandel in Portland, fijn en licht gemalen. Suikers. Amandelmeel. Cacao. In de koelcel boter per doos en room. De couverture in zakjes met glimmende, kleine druppels. Eén bak broodverbeteraar, die hij opende, rook, en waarvan hij het etiket tweemaal las.</w:t>
+        <w:t xml:space="preserve">Ze bleef bij de deur staan met haar armen over elkaar geslagen terwijl Doc de ruimte doorzocht. Hij deed het zoals hij een schuur zou hebben doorzocht: langzaam, alles bekijkend, zonder haast voor iemands gevoelens. Zakken bloem uit de groothandel in Portland, fijn en licht gemalen. Suikers. Amandelmeel. Cacao. In de koelcel boter per doos en room. De couverture in zakjes met glimmende, kleine druppels. Eén bak broodverbeteraar, die hij opende, rook, en waarvan hij het etiket tweemaal las.</w:t>
       </w:r>
     </w:p>
     <w:p/>
@@ -4593,7 +4593,7 @@
     <w:p/>
     <w:p>
       <w:r>
-        <w:t xml:space="preserve">‘Bloem, boter, couverture, amandelen, de verbeteraar,’ zei de dokter tenslotte. ‘Room. Dozen.’ Hij deed de ringband dicht. ‘Geen zuurmiddel. Op geen enkele pagina.’</w:t>
+        <w:t xml:space="preserve">‘Bloem, boter, couverture, amandelen, de verbeteraar,’ zei Doc ten slotte. ‘Room. Dozen.’ Hij deed de ringband dicht. ‘Geen zuurmiddel. Op geen enkele pagina.’</w:t>
       </w:r>
     </w:p>
     <w:p/>
@@ -4617,13 +4617,13 @@
     <w:p/>
     <w:p>
       <w:r>
-        <w:t xml:space="preserve">‘Het voegwerk? Joyce Wendt heeft me dat verteld. Ze heeft vroeger in die keuken gebakken. Ze heeft me ook over Greta’s mislukte baksels verteld, op die maandag dat ze begonnen, voordat iemand in deze laan het wist. Ze loopt al sinds oktober in en uit mijn keuken met monsters, om me brood te proberen te verkopen. En ze praat over Greta’s oude winkel alsof ze zelf de sleutel nog heeft.’ Ze pakte de ringband terug van de dokter en legde hem netjes recht op het marmer. ‘Als ik Greta’s klandizie wilde hebben, mevrouw Claus, dan zou ik die afpakken met beter gebak. Ik héb beter gebak. Is er nog iets in mijn keuken dat u wilt ruiken, dokter?’</w:t>
-      </w:r>
-    </w:p>
-    <w:p/>
-    <w:p>
-      <w:r>
-        <w:t xml:space="preserve">‘Nee, mevrouw,’ zei de dokter.</w:t>
+        <w:t xml:space="preserve">‘Het voegwerk? Joyce Wendt heeft me dat verteld. Ze heeft vroeger in die keuken gebakken. Ze heeft me ook over Greta’s mislukte baksels verteld, op die maandag dat ze begonnen, voordat iemand in deze laan het wist. Ze loopt al sinds oktober in en uit mijn keuken met monsters, om me brood te proberen te verkopen. En ze praat over Greta’s oude winkel alsof ze zelf de sleutel nog heeft.’ Ze pakte de ringband terug van Doc en legde hem netjes recht op het marmer. ‘Als ik Greta’s klandizie wilde hebben, mevrouw Claus, dan zou ik die afpakken met beter gebak. Ik héb beter gebak. Is er nog iets in mijn keuken dat u wilt ruiken, dokter?’</w:t>
+      </w:r>
+    </w:p>
+    <w:p/>
+    <w:p>
+      <w:r>
+        <w:t xml:space="preserve">‘Nee, mevrouw,’ zei Doc.</w:t>
       </w:r>
     </w:p>
     <w:p/>
@@ -4653,7 +4653,7 @@
     <w:p/>
     <w:p>
       <w:r>
-        <w:t>Op de stoep bukte de dokter om zijn veter te strikken. Pip keek met grote belangstelling toe en deed geen poging om hem tegen te houden.</w:t>
+        <w:t xml:space="preserve">Op de stoep bukte Doc om zijn veter te strikken. Pip keek met grote belangstelling toe en deed geen poging om hem tegen te houden.</w:t>
       </w:r>
     </w:p>
     <w:p/>
@@ -4671,7 +4671,7 @@
     <w:p/>
     <w:p>
       <w:r>
-        <w:t xml:space="preserve">‘Dank je wel, dokter.’</w:t>
+        <w:t xml:space="preserve">‘Dank je wel, Doc.’</w:t>
       </w:r>
     </w:p>
     <w:p/>
@@ -4707,7 +4707,7 @@
     <w:p/>
     <w:p>
       <w:r>
-        <w:t xml:space="preserve">Ik had op dat bankje gezeten met Danny Ott en gedacht dat mensen te snel hun oordeel klaar hadden. Ik had gezien hoe ze dat bij Pete deden vanwege een ketting aan een poort, en bij de familie Doucette om een oliefactuur. Ik had precies hetzelfde gedaan bij Renée Duval, alleen in stilte, waar niemand me kon vertellen dat ik ongelijk had. De dokter had dat wel gekund. Ik had hem meegenomen omdat ik er zo zeker van was dat hij dat niet zou doen.</w:t>
+        <w:t xml:space="preserve">Ik had op dat bankje gezeten met Danny Ott en gedacht dat mensen te snel hun oordeel klaar hadden. Ik had gezien hoe ze dat bij Pete deden vanwege een ketting aan een poort, en bij de familie Doucette om een oliefactuur. Ik had precies hetzelfde gedaan bij Renée Duval, alleen in stilte, waar niemand me kon vertellen dat ik ongelijk had. Doc had dat wel gekund. Ik had hem meegenomen omdat ik er zo zeker van was dat hij dat niet zou doen.</w:t>
       </w:r>
     </w:p>
     <w:p/>
@@ -4736,7 +4736,7 @@
     <w:p/>
     <w:p>
       <w:r>
-        <w:t xml:space="preserve">De vorst kwam volkomen onverwachts, zoals Dot me al had verteld dat de strenge winters altijd deden. Alleen een stille lucht en een temperatuur die de hele nacht door daalde als een gevallen steen. Ik werd wakker met ramen die tot in de hoeken wit waren beslagen, de leidingen in de muren die tikten van de kou, en ik dacht, nog voor ik aan iets anders dacht, aan het smalle stenen gebouw van het Genootschap op het plein en de oude cv-ketel die stond te bonken in de kelder. Een ketel die tijdens een dooi het al amper bijhield, trok het lang niet altijd door zo’n ijskoude nacht.</w:t>
+        <w:t xml:space="preserve">De vorst kwam volkomen onverwachts, zoals Dot me al had verteld dat de strenge vorstperiodes altijd deden. Alleen een stille lucht en een temperatuur die de hele nacht door daalde als een gevallen steen. Ik werd wakker met ramen die tot in de hoeken wit waren beslagen, de leidingen in de muren die tikten van de kou, en ik dacht, nog voor ik aan iets anders dacht, aan het smalle stenen gebouw van het Genootschap op het plein en de oude cv-ketel die stond te bonken in de kelder. Een ketel die tijdens een dooi het al amper bijhield, trok het lang niet altijd door zo’n ijskoude nacht.</w:t>
       </w:r>
     </w:p>
     <w:p/>
@@ -4754,7 +4754,7 @@
     <w:p/>
     <w:p>
       <w:r>
-        <w:t xml:space="preserve">‘De ketel van het Genootschap is kapot,’ zei ze op mijn drempel. ‘Gescheurd, dwars over de zijkant. En het dak heeft het begeven boven het archief.’</w:t>
+        <w:t xml:space="preserve">‘De ketel van het Genootschap is kapot,’ zei ze op mijn drempel. ‘Gescheurd, over de hele zijkant. En het dak heeft het begeven boven het archief.’</w:t>
       </w:r>
     </w:p>
     <w:p/>
@@ -4832,7 +4832,7 @@
     <w:p/>
     <w:p>
       <w:r>
-        <w:t xml:space="preserve">Hij werkte zonder haast en zonder ophouden. Hij tilde elk blaadje op alsof het elk moment kon scheuren. Dat kon het ook. Wanneer er eentje in zijn handen uit elkaar viel, een vel kerknotulen dat bij de vouw tot pap was vergaan, vloekte hij er niet om en frommelde hij hem niet in elkaar. Hij legde de twee zachte helften weer netjes tegen elkaar aan de rand van de scheur, om zo goed en zo kwaad als het ging te drogen, zodat wie na hem kwam in elk geval de stukken in de juiste volgorde had. Hij redde de collectie niet. Dat kon hij ook niet. Een deel was al verloren en dat wist hij beter dan wie dan ook op aarde. Hij was aan het redden wat er te redden viel, het ene natte vel na het andere, op zijn knieën, te middernacht, voor een plek die niet van hem was en naar recht en rede misschien nooit meer van hem zou worden.</w:t>
+        <w:t xml:space="preserve">Hij werkte zonder haast en zonder ophouden. Hij tilde elk blaadje op alsof het elk moment kon scheuren. Dat kon het ook. Wanneer er eentje in zijn handen uit elkaar viel, een vel kerknotulen dat bij de vouw tot pap was vergaan, vloekte hij er niet om en frommelde hij het niet in elkaar. Hij legde de twee zachte helften weer netjes tegen elkaar aan de rand van de scheur, om zo goed en zo kwaad als het ging te drogen, zodat wie na hem kwam in elk geval de stukken in de juiste volgorde had. Hij redde de collectie niet. Dat kon hij ook niet. Een deel was al verloren en dat wist hij beter dan wie dan ook op aarde. Hij was aan het redden wat er te redden viel, het ene natte vel na het andere, op zijn knieën, te middernacht, voor een plek die niet van hem was en naar recht en rede misschien nooit meer van hem zou worden.</w:t>
       </w:r>
     </w:p>
     <w:p/>
@@ -4868,7 +4868,7 @@
     <w:p/>
     <w:p>
       <w:r>
-        <w:t xml:space="preserve">‘Mevrouw Claus,’ zei hij. ‘U had er niet op uit hoeven gaan. Het is een bijtende nacht hiervoor.’</w:t>
+        <w:t xml:space="preserve">‘Mevrouw Claus,’ zei hij. ‘Je had er niet op uit hoeven gaan. Het is een bijtende nacht hiervoor.’</w:t>
       </w:r>
     </w:p>
     <w:p/>
@@ -4953,7 +4953,7 @@
     </w:p>
     <w:p>
       <w:r>
-        <w:t xml:space="preserve">‘De baksteen,’ zei ik. ‘Er zat oude grijze specie op één kant, dus die kwam uit een muur. Er ligt al sneeuw in Evergreen sinds Halloween. Niemand raapt een losse baksteen op van die straat. Er is maar één hoop oude baksteen in het hele blok.’ Ik zette het deksel van de suikerpot achter de peper. ‘In de vuilcontainer achter het pand van Fenwick, waar ze de boel heeft gestript om haar ovens te plaatsen.’</w:t>
+        <w:t xml:space="preserve">‘De baksteen,’ zei ik. ‘Er zat oude grijze mortel op één kant, dus die kwam uit een muur. Er ligt al sneeuw in Evergreen sinds Halloween. Niemand raapt een losse baksteen op van die straat. Er is maar één hoop oude baksteen in het hele blok.’ Ik zette het deksel van de suikerpot achter de peper. ‘In de vuilcontainer achter het pand van Fenwick, waar ze de boel heeft gestript om haar ovens te plaatsen.’</w:t>
       </w:r>
     </w:p>
     <w:p>
@@ -4963,7 +4963,7 @@
     </w:p>
     <w:p>
       <w:r>
-        <w:t xml:space="preserve">‘Hij komt uit haar muur. Dat is het enige waar ik een eed op kan doen.’ Ik legde een vinger op de lepel, waar de steeg achter de winkels liep. ‘Die container staat open in een openbare steeg. Geen deksel, geen slot. Pete komt erlangs. De bezorgers rijden erachter. Een kind kan een baksteen uit die container tillen. Ik zag haar puin op die baksteen en las haar naam. Draai het eens om. Als je wilde dat het dorp naar Sugarplum keek, waar zou je dan een baksteen gaan halen?’</w:t>
+        <w:t xml:space="preserve">‘Hij komt uit haar muur. Dat is het enige waar ik een eed op kan doen.’ Ik legde een vinger op de lepel, waar de steeg achter de winkels liep. ‘Die container staat open in een openbare steeg. Geen deksel, geen slot. Pete komt erlangs. De bezorgers zetten er hun wagen achteruit tegenaan. Een kind kan een baksteen uit die container tillen. Ik zag haar puin op die baksteen en las haar naam. Draai het eens om. Als je wilde dat het dorp naar Sugarplum keek, waar zou je dan een baksteen gaan halen?’</w:t>
       </w:r>
     </w:p>
     <w:p>
@@ -4973,12 +4973,12 @@
     </w:p>
     <w:p>
       <w:r>
-        <w:t xml:space="preserve">‘Wie die baksteen ook heeft gegooid, die was niet kwaad. Hij ging door de gouden letters van Greta’s naam op een avond dat er niemand op straat was. En Renée ging met mij zitten en somde alle kerkdiners van dit dorp voor me op. Die grijpt niet zomaar naar wat het dichtstbij is.’</w:t>
-      </w:r>
-    </w:p>
-    <w:p>
-      <w:r>
-        <w:t xml:space="preserve">‘Of ze dacht dat niemand twee keer naar specie zou kijken.’</w:t>
+        <w:t xml:space="preserve">‘Wie die baksteen ook heeft gegooid, die was niet kwaad. De steen ging door de gouden letters van Greta’s naam op een avond dat er niemand op straat was. En Renée ging met mij zitten en somde alle kerkdiners van dit dorp voor me op. Die grijpt niet zomaar naar wat het dichtstbij is.’</w:t>
+      </w:r>
+    </w:p>
+    <w:p>
+      <w:r>
+        <w:t xml:space="preserve">‘Of ze dacht dat niemand twee keer naar mortel zou kijken.’</w:t>
       </w:r>
     </w:p>
     <w:p>
@@ -5008,7 +5008,7 @@
     </w:p>
     <w:p>
       <w:r>
-        <w:t xml:space="preserve">‘Ze kan hem er zelfheen hebben gedragen.’</w:t>
+        <w:t xml:space="preserve">‘Ze kan hem er zelf heen hebben gedragen.’</w:t>
       </w:r>
     </w:p>
     <w:p>
@@ -5038,7 +5038,7 @@
     </w:p>
     <w:p>
       <w:r>
-        <w:t xml:space="preserve">‘Ik hechtte er helemaal geen waarde aan. Een chauffeur die even stopte om te dutten. Maar Pete kent elke vrachtwagen die dat terrein op komt, en hij zei dat het niet van de vleesleverancier was, en ik hoorde alleen: van niemand.’ Ik schoof mijn vinger langs de lepel omhoog naar de peper. ‘En Danny’s gestalte. Mager en snel, bij Greta’s drempel voordat haar ovens aangingen, en doorgelopen naar het verre eind. Ik hoorde de goudwinkel. Hij heeft nooit gezegd dat hij Sugarplum in ging. Hij zei het verre eind. Ik heb die winkel daar zelf neergezet.’</w:t>
+        <w:t xml:space="preserve">‘Ik hechtte er helemaal geen waarde aan. Een chauffeur die even stopte om te dutten. Maar Pete kent elke vrachtwagen die dat terrein op komt, en hij zei dat het niet van de vleesleverancier was, en ik hoorde alleen: van niemand.’ Ik schoof mijn vinger langs de lepel omhoog naar de peper. ‘En Danny’s gestalte. Mager en snel, bij Greta’s drempel voordat haar ovens aangingen, en doorgelopen naar het verre eind. Ik hoorde de goudwinkel. Hij heeft nooit gezegd dat die Sugarplum in ging. Hij zei het verre eind. Ik heb die winkel daar zelf neergezet.’</w:t>
       </w:r>
     </w:p>
     <w:p>
@@ -5068,7 +5068,7 @@
     </w:p>
     <w:p>
       <w:r>
-        <w:t xml:space="preserve">‘De ochtend dat ze allemaal liepen, trok de rest naar de brink en leunde richting Hollyhock Lane en jouw haard. Die ene ging de andere kant op, drie meter buiten hun gezelschap, langs de apotheek, tot aan het einde van de steeg. Ik ging ervoor staan en vroeg waar hij in godsnaam naar keek.’ Ik raakte het korstje aan waar het daar eenzaam lag. ‘Ik had in mijn hoofd gehaald dat hij ergens naar keek. Ik heb nooit gevraagd waar hij stond. Op dat ene plekje aan die kant waar een busje van de laan kon afdraaien zonder dat iemand aan Greta’s kant het zou zien.’</w:t>
+        <w:t xml:space="preserve">‘De ochtend dat ze allemaal liepen, trok de rest naar de brink en leunde richting Hollyhock Lane en jouw haard. Die ene ging de andere kant op, drie meter buiten hun gezelschap, langs de apotheek, tot aan het einde van de steeg. Ik ging ervoor staan en vroeg waar hij naar keek.’ Ik raakte het korstje aan waar het daar eenzaam lag. ‘Ik had in mijn hoofd gehaald dat hij ergens naar keek. Ik heb nooit gevraagd waar hij stond. Op dat ene plekje aan die kant waar een busje van de laan kon afdraaien zonder dat iemand aan Greta’s kant het zou zien.’</w:t>
       </w:r>
     </w:p>
     <w:p>
@@ -5128,7 +5128,7 @@
     </w:p>
     <w:p>
       <w:r>
-        <w:t xml:space="preserve">‘Dat is wat ik geloofde. Toen ging de dokter op donderdag door haar voorraadruimte en was er geen zuurmiddel te bekennen, en vertelde ze me wie er tegen haar had zitten praten over het voegwerk van Greta.’ Daar ging ik niet verder op in, aangezien ik had gezworen om het voor de nacht niet meer over gezichten te hebben. ‘Dus houd ik het papier over. Een flyer ligt al lang als drukproef op iemands toonbank voordat hij als flyer op een bord hangt. Iemand heeft hem daar gezien. Iemand heeft die week erop gelezen en een klacht ingediend bij de county om daarin te passen.’</w:t>
+        <w:t xml:space="preserve">‘Dat is wat ik geloofde. Toen ging Doc op donderdag door haar voorraadruimte en was er geen zuurmiddel te bekennen, en vertelde ze me wie er tegen haar had zitten praten over het voegwerk van Greta.’ Daar ging ik niet verder op in, aangezien ik had gezworen om het voor de nacht niet meer over gezichten te hebben. ‘Dus houd ik het papier over. Een flyer ligt al lang als drukproef op iemands toonbank voordat hij als flyer op een bord hangt. Iemand heeft hem daar gezien. Iemand heeft die week erop gelezen en een klacht ingediend bij de county om daarin te passen.’</w:t>
       </w:r>
     </w:p>
     <w:p>
@@ -5207,7 +5207,7 @@
     <w:p/>
     <w:p>
       <w:r>
-        <w:t xml:space="preserve">‘En ze had ons zelf wel gebeld,’ zei Martha. ‘Ze belde me in oktober nog om te controleren of ik wel de broodjes wilde en niet het brood. Ze schuift haar klanten niet zo zomaar door naar een ander.’</w:t>
+        <w:t xml:space="preserve">‘En ze had ons zelf wel gebeld,’ zei Martha. ‘Ze belde me in oktober nog om te controleren of ik wel de broodjes wilde en niet het brood. Ze schuift haar klanten niet zomaar door naar een ander.’</w:t>
       </w:r>
     </w:p>
     <w:p/>
@@ -5285,7 +5285,7 @@
     <w:p/>
     <w:p>
       <w:r>
-        <w:t xml:space="preserve">‘Het onderdeel voor de handwasbak is nog steeds niet binnen,’ zei ze nog voor ik gedag had gezegd. ‘Tom heeft donderdag de tochtstrip gedaan. Het voegwerk heb ik zelf gedicht. En de county komt niet terug voordat die handwasbak in orde is.’ Ze liep weer achter de toonbank. ‘Ga zitten. Ik zet de waterkoker aan. Ik heb er niets lekkers bij om je te geven.’</w:t>
+        <w:t xml:space="preserve">‘Het onderdeel voor de handwasbak is nog steeds niet binnen,’ zei ze nog voor ik gedag had gezegd. ‘Tom heeft donderdag de tochtstrip gedaan. Het voegwerk heb ik zelf gedicht. En de county komt niet terug voordat die handwasbak in orde is.’ Ze liep weer achter de toonbank. ‘Ga zitten. Ik zet water op. Ik heb er niets lekkers bij om je te geven.’</w:t>
       </w:r>
     </w:p>
     <w:p/>
@@ -5309,7 +5309,7 @@
     <w:p/>
     <w:p>
       <w:r>
-        <w:t xml:space="preserve">‘Ik zal ze moeten opbellen.’ Ze vulde de waterkoker achterin. ‘Als ik de twintigste niet open ben, moet ik elke naam in dat boek bellen en ze vertellen dat ze voor hun taarten ergens anders heen moeten. Veertig jaar lang, en ik heb dat nog nooit hoeven doen.’ Ze zette de waterkoker op de ring. ‘Ik ben er vanmorgen voor gaan zitten. Ik heb er nog niet één gedraaid.’</w:t>
+        <w:t xml:space="preserve">‘Ik zal ze moeten opbellen.’ Ze vulde de ketel achterin. ‘Als ik de twintigste niet open ben, moet ik elke naam in dat boek bellen en ze vertellen dat ze voor hun taarten ergens anders heen moeten. Veertig jaar lang, en ik heb dat nog nooit hoeven doen.’ Ze zette de ketel op het vuur. ‘Ik ben er vanmorgen voor gaan zitten. Ik heb er nog niet één gedraaid.’</w:t>
       </w:r>
     </w:p>
     <w:p/>
@@ -5321,7 +5321,7 @@
     <w:p/>
     <w:p>
       <w:r>
-        <w:t xml:space="preserve">Greta draaide zich om vanaf het fornuis en keerde me een frons toe. ‘Niemand raakt dat boek aan behalve ik.’</w:t>
+        <w:t xml:space="preserve">Greta draaide zich om vanaf het fornuis en fronste naar me. ‘Niemand raakt dat boek aan behalve ik.’</w:t>
       </w:r>
     </w:p>
     <w:p/>
@@ -5333,7 +5333,7 @@
     <w:p/>
     <w:p>
       <w:r>
-        <w:t xml:space="preserve">Greta’s hand bleef rusten op de handgreep van de waterkoker.</w:t>
+        <w:t xml:space="preserve">Greta’s hand bleef rusten op het handvat van de ketel.</w:t>
       </w:r>
     </w:p>
     <w:p/>
@@ -5399,7 +5399,7 @@
     <w:p/>
     <w:p>
       <w:r>
-        <w:t xml:space="preserve">‘Pete zegt zo veel.’ Greta veegde met haar handpalm langs haar oog, snel, alsof ze er bloem van afveegde. ‘Ik vind hem op sommige ochtenden loshangen, en dan hang ik hem weer aan de ketting. Ik dacht dat hij het was. Uit kleinserigheid. Dat hij hem eraf haalde om een punt te maken over mijn overval.’</w:t>
+        <w:t xml:space="preserve">‘Pete zegt zo veel.’ Greta veegde met haar handpalm langs haar oog, snel, alsof ze er bloem van afveegde. ‘Ik vind het op sommige ochtenden loshangen, en dan hang ik het weer aan de ketting. Ik dacht dat hij het was. Uit kleinzieligheid. Dat hij het eraf haalde om een punt te maken over mijn overval.’</w:t>
       </w:r>
     </w:p>
     <w:p/>
@@ -5561,7 +5561,7 @@
     </w:p>
     <w:p>
       <w:r>
-        <w:t xml:space="preserve">‘Bij Pelkey’s, in Lewiston. Elke groothandel in bakkerijproducten aan deze kant van de bergen koopt bij Pelkey’s.’ Ze haalde adem. ‘Joyce heeft daar in het eerste jaar zelf onze rekening geopend, en toen ze wegging heeft ze die meegenomen, en die zal ze niet veranderd hebben. Joyce ruziet nog liever met een leverancier dan er eentje op te zeggen.’ Nog een zucht. ‘Kom vandaag niet langs. En wees ook niet lief voor mij aan de telefoon. Dat trek ik niet.’</w:t>
+        <w:t xml:space="preserve">‘Bij Pelkey’s, in Lewiston. Elke groothandelsbakkerij aan deze kant van de bergen koopt bij Pelkey’s.’ Ze haalde adem. ‘Joyce heeft daar in het eerste jaar zelf onze rekening geopend, en toen ze wegging heeft ze die meegenomen, en die zal ze niet veranderd hebben. Joyce ruziet nog liever met een leverancier dan er eentje op te zeggen.’ Nog een zucht. ‘Kom vandaag niet langs. En wees ook niet lief voor mij aan de telefoon. Dat trek ik niet.’</w:t>
       </w:r>
     </w:p>
     <w:p>
@@ -5576,7 +5576,7 @@
     </w:p>
     <w:p>
       <w:r>
-        <w:t>Claire had de waterkoker al aan staan voordat ik had aangeklopt. Op haar keukentafel lag het zaterdagcryptogram, voor de helft ingevuld met pen, en een laptop met het logo van de Gazette op het deksel. Pip nestelde zich onder de tafel naast de printer, die op een krukje stond en overduidelijk ouder was dan de laptop.</w:t>
+        <w:t xml:space="preserve">Claire had de waterkoker al aan staan voordat ik had aangeklopt. Op haar keukentafel lag de zaterdagkruiswoordpuzzel, voor de helft ingevuld met pen, en een laptop met het logo van de Gazette op het deksel. Pip nestelde zich onder de tafel naast de printer, die op een krukje stond en overduidelijk ouder was dan de laptop.</w:t>
       </w:r>
     </w:p>
     <w:p>
@@ -5739,7 +5739,7 @@
     </w:p>
     <w:p>
       <w:r>
-        <w:t>Ik viel niet meteen met de deur in huis.</w:t>
+        <w:t xml:space="preserve">Ik vertelde niet alles.</w:t>
       </w:r>
     </w:p>
     <w:p>
@@ -5838,7 +5838,7 @@
     </w:p>
     <w:p>
       <w:r>
-        <w:t>Pip liep naar het kastje toe en nam een post voor de deur in.</w:t>
+        <w:t xml:space="preserve">Pip liep naar het kastje toe en vatte post voor de deur.</w:t>
       </w:r>
     </w:p>
     <w:p>
@@ -5854,7 +5854,7 @@
     </w:p>
     <w:p>
       <w:r>
-        <w:t xml:space="preserve">Claire’s blaadje lag nog waar ik het had achtergelaten, netjes onder de suikerpot geschoven, een uittreksel uit het handelsregister van de staat met bovenaan de naam van een bedrijf en een paar regels lager de naam van Joyce Wendt. Daarnaast lag het briefje van Doc, ondertekend en gedateerd. Pip lag te slapen bij het fornuis met haar snavel onder haar vleugel gestoken, en het fornuis nagloeide nog van het laatste vuur van de nacht.</w:t>
+        <w:t xml:space="preserve">Claire’s blaadje lag nog waar ik het had achtergelaten, netjes onder de suikerpot geschoven, een uittreksel uit het handelsregister van de staat met bovenaan de naam van een bedrijf en een paar regels lager de naam van Joyce Wendt. Daarnaast lag het briefje van Doc, ondertekend en gedateerd. Pip lag te slapen bij het fornuis met haar snavel onder haar vleugel gestoken, en het fornuis gloeide nog na van het laatste vuur van de nacht.</w:t>
       </w:r>
     </w:p>
     <w:p>
@@ -5949,7 +5949,7 @@
     </w:p>
     <w:p>
       <w:r>
-        <w:t xml:space="preserve">‘Danny Ott zag een magere, snelle gestalte voor dag en dauw bij Greta’s drempel staan, weglopend naar het verre eind. Een andere ochtend zag hij een doos met goud op het etiket bij haar deur staan. Claire’s blaadje brengt Joyce in verband met de brief van de advocaat die Greta in augustus verscheurde.’ Ik raakte het opgevouwen papier op mijn schoot aan. ‘Renée’s flyer voor haar openingsweek lag tot en met oktober als proefdruk op haar toonbank, terwijl Joyce haar opzocht met monsters, en de klacht viel precies in die week op de mat. De flyer hing pas de dertigste op het bord van de dorpszaal. De zak van Pelkey ging op de zevenentwintigste naar Bridgton. En het briefje van Doc zegt dat het poeder in mijn pot overeenkomt met het zuurmiddel, test na test.’</w:t>
+        <w:t xml:space="preserve">‘Danny Ott zag een magere, snelle gestalte voor dag en dauw bij Greta’s drempel staan, weglopend naar het verre eind. Een andere ochtend zag hij een doos met goud op het etiket bij haar deur staan. Claire’s blaadje brengt Joyce in verband met de brief van de advocaat die Greta in augustus verscheurde.’ Ik raakte het opgevouwen papier op mijn schoot aan. ‘Renée’s flyer voor haar openingsweek lag tot en met oktober als drukproef op haar toonbank, terwijl Joyce haar opzocht met monsters, en de klacht viel precies in die week op de mat. De flyer hing pas de dertigste op het bord van de dorpszaal. De zak van Pelkey ging op de zevenentwintigste naar Bridgton. En het briefje van Doc zegt dat het poeder in mijn pot overeenkomt met het zuurmiddel, test na test.’</w:t>
       </w:r>
     </w:p>
     <w:p>
@@ -6059,7 +6059,7 @@
     </w:p>
     <w:p>
       <w:r>
-        <w:t xml:space="preserve">Tanaka rekte het niet. Ze legde de facturen voor haar neer en vertelde haar zonder omwegen wat ze waren, en vervolgens wat Claire in het handelsregister had gevonden, wat Pete bij de apotheek had gezien, en als laatste waar de baksteen vermoedelijk vandaan was gekomen.</w:t>
+        <w:t xml:space="preserve">Tanaka draaide er niet omheen. Ze legde de facturen voor haar neer en vertelde haar zonder omwegen wat ze waren, en vervolgens wat Claire in het handelsregister had gevonden, wat Pete bij de apotheek had gezien, en als laatste waar de baksteen vermoedelijk vandaan was gekomen.</w:t>
       </w:r>
     </w:p>
     <w:p>
@@ -6069,7 +6069,7 @@
     </w:p>
     <w:p>
       <w:r>
-        <w:t xml:space="preserve">‘Die brief van die advocaat in augustus,’ zei ze. ‘Stillwater. Ze wilden het hele pand, tot de inventaris en de naam toe.’</w:t>
+        <w:t xml:space="preserve">‘Die brief van die advocaat in augustus,’ zei ze. ‘Stillwater. Ze wilden de hele zaak, alles erop en eraan, inclusief de naam.’</w:t>
       </w:r>
     </w:p>
     <w:p>
@@ -6413,7 +6413,7 @@
     </w:p>
     <w:p>
       <w:r>
-        <w:t>Pip kwam toen van onder de tafel tevoorschijn. Ze liep er in een lange boog omheen, voorbij Joyce’s stoel, en kwam aan onze kant weer naar voren om bij Greta’s stoel te stoppen. Toen draaide ze heel duidelijk en opzettelijk haar rug naar Joyce toe, nestelde zich met haar gezicht naar Greta en begon haar eigen schouder te poetsen. Het zachte, droge geritsel daarvan was lange tijd het enige geluid in de kamer.</w:t>
+        <w:t xml:space="preserve">Pip kwam toen van onder de tafel tevoorschijn. Ze liep er in een lange boog omheen, voorbij Joyce’s stoel, en kwam aan onze kant weer naar voren om bij Greta’s stoel te stoppen. Toen draaide ze heel duidelijk en opzettelijk haar rug naar Joyce toe, nestelde zich met haar gezicht naar Greta en begon de veren op haar schouder glad te strijken. Het zachte, droge geritsel daarvan was lange tijd het enige geluid in de kamer.</w:t>
       </w:r>
     </w:p>
     <w:p>
@@ -6433,7 +6433,7 @@
     </w:p>
     <w:p>
       <w:r>
-        <w:t xml:space="preserve">‘U zult nu wel een advocaat willen, mevrouw Wendt,’ zei ze, niet onvriendelijk. ‘Dat is uw goed recht, en in uw plaats zou ik het ook doen. Maar ik wil hier wel duidelijk over zijn, zodat niemand straks in de war raakt. Wat ik heb is een leveranciersadministratie met uw handtekening erop, de vergelijking van een scheikundige, een register van de staat, een man die uw busje herkent, en twee vrouwen die door uw bakkerij zijn gebeld met bestellingen uit een boek dat u helemaal niet had mogen inzien. Alles staat zwart-op-wit. Er hoeft niets door u te worden bekend.’ Ze legde de pen neer. ‘Wat u vanmiddag ook mocht spijten, en ik denk dat dat er wel is, het verandert geen letter op de pagina. U wordt vandaag nog aangeklaagd. Bel uw advocaat, kom met hem om zes uur terug, en dan handelen we de rest in stilte af.’</w:t>
+        <w:t xml:space="preserve">‘U zult nu wel een advocaat willen, mevrouw Wendt,’ zei ze, niet onvriendelijk. ‘Dat is uw goed recht, en in uw plaats zou ik het ook doen. Maar ik wil hier wel duidelijk over zijn, zodat niemand straks in de war raakt. Wat ik heb is een leveranciersadministratie met uw handtekening erop, de vergelijking van een scheikundige, een register van de staat, een man die uw busje herkent, en twee vrouwen die door uw bakkerij zijn gebeld met bestellingen uit een boek dat u helemaal niet had mogen inzien. Alles staat zwart-op-wit. U hoeft niets te bekennen.’ Ze legde de pen neer. ‘Wat u vanmiddag ook mocht spijten, en ik denk dat dat er wel is, het verandert geen letter op de pagina. U wordt vandaag nog aangeklaagd. Bel uw advocaat, kom met hem om zes uur terug, en dan handelen we de rest in stilte af.’</w:t>
       </w:r>
     </w:p>
     <w:p>
@@ -6458,7 +6458,7 @@
     </w:p>
     <w:p>
       <w:r>
-        <w:t>De papieren zak met broodjes lag er nog net zo bij op de hoek van de tafel als ze had achtergelaten.</w:t>
+        <w:t xml:space="preserve">De papieren zak met broodjes lag er nog net zo bij op de hoek van de tafel als ze hem had achtergelaten.</w:t>
       </w:r>
     </w:p>
     <w:p>
@@ -6562,7 +6562,7 @@
     <w:p/>
     <w:p>
       <w:r>
-        <w:t xml:space="preserve">Ik was niet van plan naar de rechtbank te gaan, en ik dacht niet dat Greta dat zou doen. Ze had Joyce aangekeken over de tafel van de politiechef, en dat was haar genoeg. Maar ik bleef zitten en hoorde de verliezen opnoemen in de nuchtere taal van de wet, elk ervan gekoppeld aan de vrouw die het had veroorzaakt, en het voelde alsof ik een bot weer op zijn plek voelde schieten.</w:t>
+        <w:t xml:space="preserve">Ik was niet van plan naar de rechtbank te gaan, en ik dacht niet dat Greta dat zou doen. Ze had Joyce aangekeken over de tafel van de politiechef, en dat was haar genoeg. Maar ik bleef zitten en hoorde de verliezen opnoemen in de nuchtere taal van de wet, elk ervan gekoppeld aan de vrouw die het had veroorzaakt, en het was alsof ik een bot weer op zijn plek voelde schieten.</w:t>
       </w:r>
     </w:p>
     <w:p/>
@@ -6604,7 +6604,7 @@
     <w:p/>
     <w:p>
       <w:r>
-        <w:t xml:space="preserve">Ik liep Evergreen weer op, voorbij de Holly Jolly. Het was nog steeds dicht, de gele kennisgeving van de county hing nog in het raam totdat Varney hem zou komen weghalen, maar er brandde achterin licht en het rook bij de deur naar gebak, hoewel ze nog niemand had om aan te verkopen. Ik klopte niet. Het bedrag was aan de politiechef om haar te brengen.</w:t>
+        <w:t xml:space="preserve">Ik liep Evergreen weer op, voorbij de Holly Jolly. Het was nog steeds dicht, de gele kennisgeving van de county hing nog in het raam totdat Varney hem zou komen weghalen, maar er brandde achterin licht en het rook bij de deur naar gebak, hoewel ze nog niemand had om aan te verkopen. Ik klopte niet. Het was aan de politiechef om haar dat bedrag te komen vertellen.</w:t>
       </w:r>
     </w:p>
     <w:p/>
@@ -6694,7 +6694,7 @@
     <w:p/>
     <w:p>
       <w:r>
-        <w:t>De assistente draaide het bordje naar OPEN toen ik naar buiten liep. Vrouwen van de kerkmaaltijden stonden al te wachten op de stoep en stampten hun laarzen schoon, en ze liepen om Pip heen om uit de wind naar binnen te gaan. Pip gaf de deurschraper nog een tik en kwam achter me aan naar de stoep.</w:t>
+        <w:t xml:space="preserve">De assistente draaide het bordje naar OPEN toen ik naar buiten liep. Vrouwen van de kerkdiners stonden al te wachten op de stoep en stampten hun laarzen schoon, en ze liepen om Pip heen om uit de wind naar binnen te gaan. Pip gaf de deurschraper nog een tik en kwam achter me aan naar de stoep.</w:t>
       </w:r>
     </w:p>
     <w:p/>
@@ -6724,7 +6724,7 @@
     <w:p/>
     <w:p>
       <w:r>
-        <w:t xml:space="preserve">‘Theo biechtte het op zodra hij gevonden was,’ zei ik. ‘Joyce kwam pas helemaal aan het einde, een beetje, toen het niets meer kon veranderen.’ Ik nam een slok. ‘Het ziekenhuis heeft haar de laan uitgestuurd. De herbergen ook.’</w:t>
+        <w:t xml:space="preserve">‘Theo biechtte het op zodra hij ontmaskerd was,’ zei ik. ‘Joyce kwam pas helemaal aan het einde, een beetje, toen het niets meer kon veranderen.’ Ik nam een slok. ‘Het ziekenhuis heeft haar de laan uitgestuurd. De herbergen ook.’</w:t>
       </w:r>
     </w:p>
     <w:p/>
@@ -6959,7 +6959,7 @@
     </w:p>
     <w:p>
       <w:r>
-        <w:t xml:space="preserve">Er was een gemakkelijkere weg geweest. Weken geleden had meneer Worthington aangeboden om het hele bedrag op één cheque te schrijven. Ik had hem gevraagd het achter de hand te houden, en had me tijdens de koude wandeling naar huis afgevraagd of ik wijs of alleen maar koppig was geweest. Nu wist ik het. Ik stond in de samengeperste sneeuw van het pleintje in de vroege ochtendgrijsheid, mijn adem pluizend in de kou, terwijl de eerste sleeën en handkarren de laan opreden richting de groene deur van het Genootschap. Zijn aanbod stond nog steeds als het dorp tekortschoot, en ik was niet van plan erom te sturen tenzij het echt moest. Als het dorp zelf voor zijn eigen dak betaalde, zou het gebouw ook echt van het dorp zijn, tot aan de bevroren drempels toe. Dit was de ochtend waarop we betaalden.</w:t>
+        <w:t xml:space="preserve">Er was een gemakkelijkere weg geweest. Weken geleden had meneer Worthington aangeboden om het hele bedrag op één cheque te schrijven. Ik had hem gevraagd het achter de hand te houden, en had me tijdens de koude wandeling naar huis afgevraagd of ik wijs of alleen maar koppig was geweest. Nu wist ik het. Ik stond in de samengeperste sneeuw van het plein in de vroege ochtendgrijsheid, mijn adem wit in de kou, terwijl de eerste sleeën en handkarren de laan opreden richting de groene deur van het Genootschap. Zijn aanbod stond nog steeds als het dorp tekortschoot, en ik was niet van plan erom te sturen tenzij het echt moest. Als het dorp zelf voor zijn eigen dak betaalde, zou het gebouw ook echt van het dorp zijn, tot aan de bevroren drempels toe. Dit was de ochtend waarop we betaalden.</w:t>
       </w:r>
     </w:p>
     <w:p>
@@ -6984,7 +6984,7 @@
     </w:p>
     <w:p>
       <w:r>
-        <w:t>Het dak was als eerste aan de beurt, omdat het dak een race tegen de volgende strenge vorst was. Het ging omhoog op de manier van een boerenschuur, ieders handen aan dezelfde taak op hetzelfde moment.</w:t>
+        <w:t xml:space="preserve">Het dak was als eerste aan de beurt, omdat het dak een race tegen de volgende strenge vorst was. Het ging omhoog zoals bij het optrekken van een schuur, ieders handen aan dezelfde taak op hetzelfde moment.</w:t>
       </w:r>
     </w:p>
     <w:p>
@@ -7039,7 +7039,7 @@
     </w:p>
     <w:p>
       <w:r>
-        <w:t xml:space="preserve">Halverwege de middag had Hal een tweede sigarenkistje naar de Starlight laten sturen.</w:t>
+        <w:t xml:space="preserve">Halverwege de middag had Hal iemand naar de Starlight gestuurd om een tweede sigarenkistje te halen.</w:t>
       </w:r>
     </w:p>
     <w:p>
@@ -7086,7 +7086,7 @@
     </w:p>
     <w:p>
       <w:r>
-        <w:t xml:space="preserve">Buiten het glas stond een rijtje sneeuwmannen van de kinderen op de brink, met kolenogen gekeerd naar het Genootschap.</w:t>
+        <w:t xml:space="preserve">Buiten, voorbij het glas, stond een rijtje sneeuwmannen van de kinderen op de brink, met kolenogen gekeerd naar het Genootschap.</w:t>
       </w:r>
     </w:p>
     <w:p/>
@@ -7214,7 +7214,7 @@
     </w:p>
     <w:p>
       <w:r>
-        <w:t xml:space="preserve">Hij had om toestemming gevraagd, en de tekening onder glas te voorschijn laten halen, de stijve, met potlood getekende stichters aan de ene kant en Eliza Frosts bruine hand aan de andere. Hij las het voor aan de verzamelde menigte met zijn zorgvuldige stem.</w:t>
+        <w:t xml:space="preserve">Hij had om toestemming gevraagd, en de tekening onder glas tevoorschijn laten halen, de stijve, met potlood getekende stichters aan de ene kant en Eliza Frosts bruine handschrift aan de andere. Hij las het voor aan de verzamelde menigte met zijn zorgvuldige stem.</w:t>
       </w:r>
     </w:p>
     <w:p>
@@ -7239,7 +7239,7 @@
     </w:p>
     <w:p>
       <w:r>
-        <w:t>Toen deed Pip haar duit in het zakje. Ze was de hele avond om de tafel gecirkeld met de glimmende blik van een vogel die wist dat er een sardine in mijn jaszak zat. Ze kreeg haar snavel in de zak, kwam te voorschijn met de sardine, en hield hem al over de rand van de doos voordat ik haar bij haar middel greep en optilde.</w:t>
+        <w:t xml:space="preserve">Toen deed Pip haar duit in het zakje. Ze was de hele avond om de tafel gecirkeld met de glimmende blik van een vogel die wist dat er een sardine in mijn jaszak zat. Ze kreeg haar snavel in de zak, kwam tevoorschijn met de sardine, en hield hem al over de rand van de doos voordat ik haar bij haar middel greep en optilde.</w:t>
       </w:r>
     </w:p>
     <w:p>
@@ -7307,13 +7307,13 @@
     <w:p/>
     <w:p>
       <w:r>
-        <w:t>Greta stond bij de lange tafel in de bloem, mouwen opgerold tot haar ellenbogen, en bewerkte een dienblad met stervormige koekjes met snelle, vaardige handen. Er was rijp gegroeid op de onderhoeken van de ruiten vannacht, en de ruiten erboven stonden nat van de stoom van de ovens. Er stond al een kluitje klanten bij de vitrine, die hun jassen dichtknoopten over pakjes, helemaal niet haastig om weer naar buiten te gaan in november.</w:t>
-      </w:r>
-    </w:p>
-    <w:p/>
-    <w:p>
-      <w:r>
-        <w:t xml:space="preserve">‘Je bent vroeg,’ zei Greta zonder op te kijken, terwijl ze het dienblad erin schoof en de oven sloot met haar heup. ‘De kransbestelling is nog niet ingepakt. Ga zitten. Neem wat. Ik heb een kruidbrood uit de oven dat een oordeel nodig heeft.’</w:t>
+        <w:t xml:space="preserve">Greta stond bij de lange tafel in de bloem, mouwen opgerold tot haar ellenbogen, en bewerkte een bakplaat met stervormige koekjes met snelle, vaardige handen. Er was rijp gegroeid op de onderhoeken van de ruiten vannacht, en de ruiten erboven stonden nat van de stoom van de ovens. Er stond al een kluitje klanten bij de vitrine, die hun jassen dichtknoopten over pakjes, helemaal niet haastig om weer naar buiten te gaan in november.</w:t>
+      </w:r>
+    </w:p>
+    <w:p/>
+    <w:p>
+      <w:r>
+        <w:t xml:space="preserve">‘Je bent vroeg,’ zei Greta zonder op te kijken, terwijl ze de bakplaat erin schoof en de oven sloot met haar heup. ‘De kransbestelling is nog niet ingepakt. Ga zitten. Neem wat. Ik heb een kruidbrood uit de oven dat een oordeel nodig heeft.’</w:t>
       </w:r>
     </w:p>
     <w:p/>
@@ -7379,7 +7379,7 @@
         <w:rPr>
           <w:i/>
         </w:rPr>
-        <w:t xml:space="preserve">Over de taart. Ik heb mezelf vijfentwintig jaar lang wijsgemaakt dat het de mijne was. De pecannoten van mijn moeder, mijn idee. Maar ik heb er geen een meer gebakken sinds de dag dat ik wegliep, en jij hebt hem elke ochtend gebakken. Laat je kaartje in de doos zitten.</w:t>
+        <w:t xml:space="preserve">Over de taart. Ik heb mezelf vijfentwintig jaar lang wijsgemaakt dat het de mijne was. De pecannoten van mijn moeder, mijn idee. Maar ik heb er geen één meer gebakken sinds de dag dat ik wegliep, en jij hebt hem elke ochtend gebakken. Laat je kaartje in de doos zitten.</w:t>
       </w:r>
     </w:p>
     <w:p/>
@@ -7466,7 +7466,7 @@
     <w:p/>
     <w:p>
       <w:r>
-        <w:t>Pip nam het sardientje en trok zich terug onder een stoel om ervan te genieten buiten het bereik van enige verandering van hart. Greta ging weer verder met haar sterren, en de ovens tikten.</w:t>
+        <w:t xml:space="preserve">Pip nam het sardientje en trok zich terug onder een stoel om ervan te genieten voordat iemand zich kon bedenken. Greta ging weer verder met haar sterren, en de ovens tikten.</w:t>
       </w:r>
     </w:p>
     <w:p/>
@@ -7484,7 +7484,7 @@
     <w:p/>
     <w:p>
       <w:r>
-        <w:t xml:space="preserve">Het Genootschap voelde nu anders aan, en het kostte me een stap om het een naam te geven. Het gebouw van het Genootschap was warm, helemaal tot aan de deur, zoals het niet meer was geweest sinds ik er voor het eerst binnenstapte. De nieuwe cv-ketel stuurde haar lage, gestage hitte omhoog door het oude ijzer, en het dak boven de archiefkamer lag heel en donker en schudde de sneeuw keurig af. De deuren stonden open voor wie maar wilde schuilen voor de kou, wat op die ochtend een behoorlijk aantal was.</w:t>
+        <w:t xml:space="preserve">Het Genootschap voelde nu anders aan, en het kostte me een stap om het een naam te geven. Het gebouw van het Genootschap was warm, helemaal tot aan de deur, zoals het niet meer was geweest sinds ik er voor het eerst binnenstapte. De nieuwe cv-ketel stuurde zijn lage, gestage hitte omhoog door het oude ijzer, en het dak boven de archiefkamer lag heel en donker en schudde de sneeuw keurig af. De deuren stonden open voor wie maar wilde schuilen voor de kou, wat op die ochtend een behoorlijk aantal was.</w:t>
       </w:r>
     </w:p>
     <w:p/>
@@ -7556,7 +7556,7 @@
     <w:p/>
     <w:p>
       <w:r>
-        <w:t>Ik kwam thuis in het blauw van de middag bij een brandende lamp in het werkhuis aan de overkant van het erf, en vond Nick binnen bij de haard.</w:t>
+        <w:t xml:space="preserve">Ik kwam thuis in het blauw van de middag bij een brandende lamp in de werkplaats aan de overkant van het erf, en vond Nick binnen bij de haard.</w:t>
       </w:r>
     </w:p>
     <w:p/>
@@ -7586,7 +7586,7 @@
     <w:p/>
     <w:p>
       <w:r>
-        <w:t xml:space="preserve">Het was daar onder mijn handpalm: de losse, blije magie van duizend Kerstmissen, een handbreedte dichter naar zijn haard getrokken. Voorbij het raam van het werkhuis viel de sneeuw gestaag over het erf en het laantje. Het zou ook over het stadje vallen, over de dozen in het Genootschap en de sneeuwmannen op de brink. Op Evergreen zou Greta alle zes de ovens aan hebben tegen de duisternis.</w:t>
+        <w:t xml:space="preserve">Het was daar onder mijn handpalm: de losse, blije magie van duizend Kerstmissen, een handbreedte dichter naar zijn haard getrokken. Voorbij het raam van de werkplaats viel de sneeuw gestaag over het erf en het laantje. Het zou ook over het stadje vallen, over de dozen in het Genootschap en de sneeuwmannen op de brink. Op Evergreen zou Greta alle zes de ovens aan hebben tegen de duisternis.</w:t>
       </w:r>
     </w:p>
     <w:p/>
@@ -7598,7 +7598,7 @@
     <w:p/>
     <w:p>
       <w:r>
-        <w:t xml:space="preserve">Nicks hand bleef warm over de mijne op de steen, en de sneeuw viel. Ik zat daar in het bijna-donker met mijn echtgenoot en mijn pinguïn en een haard die warmer was dan hij enig recht toe had. Ik wilde nergens anders zijn in de hele wijdse, koude wereld.</w:t>
+        <w:t xml:space="preserve">Nicks hand bleef warm over de mijne op de steen, en de sneeuw viel. Ik zat daar in het bijna-donker met mijn echtgenoot en mijn pinguïn en een haard die warmer was dan hij eigenlijk mocht zijn. Ik wilde nergens anders zijn in de hele wijdse, koude wereld.</w:t>
       </w:r>
     </w:p>
     <w:p/>

</xml_diff>